<commit_message>
Format and wording revisions upon restart of this version
</commit_message>
<xml_diff>
--- a/Platform/Platform_sngl_side.docx
+++ b/Platform/Platform_sngl_side.docx
@@ -2,7 +2,7 @@
 <file path=word/document.xml><?xml version="1.0" encoding="utf-8"?>
 <w:document xmlns:w="http://schemas.openxmlformats.org/wordprocessingml/2006/main" xmlns:m="http://schemas.openxmlformats.org/officeDocument/2006/math" xmlns:r="http://schemas.openxmlformats.org/officeDocument/2006/relationships" xmlns:o="urn:schemas-microsoft-com:office:office" xmlns:v="urn:schemas-microsoft-com:vml" xmlns:w10="urn:schemas-microsoft-com:office:word" xmlns:a="http://schemas.openxmlformats.org/drawingml/2006/main" xmlns:pic="http://schemas.openxmlformats.org/drawingml/2006/picture" xmlns:wp="http://schemas.openxmlformats.org/drawingml/2006/wordprocessingDrawing">
   <w:body>
-    <w:bookmarkStart w:id="85" w:name="platform---set-up-list"/>
+    <w:bookmarkStart w:id="64" w:name="platform---set-up-list"/>
     <w:p>
       <w:pPr>
         <w:pStyle w:val="Heading1"/>
@@ -165,7 +165,7 @@
         <w:br w:type="page"/>
       </w:r>
     </w:p>
-    <w:bookmarkStart w:id="25" w:name="step-1"/>
+    <w:bookmarkStart w:id="23" w:name="step-1"/>
     <w:p>
       <w:pPr>
         <w:pStyle w:val="Heading2"/>
@@ -260,89 +260,55 @@
         <w:br w:type="page"/>
       </w:r>
     </w:p>
-    <w:tbl>
-      <w:tblPr>
-        <w:tblStyle w:val="Table"/>
-        <w:tblW w:type="pct" w:w="5000"/>
-        <w:tblLayout w:type="fixed"/>
-        <w:tblLook w:firstRow="0" w:lastRow="0" w:firstColumn="0" w:lastColumn="0" w:noHBand="0" w:noVBand="0" w:val="0000"/>
-      </w:tblPr>
-      <w:tblGrid>
-        <w:gridCol w:w="7920"/>
-      </w:tblGrid>
-      <w:tr>
-        <w:tc>
-          <w:tcPr/>
-          <w:bookmarkStart w:id="24" w:name="fig-539a35d47e664c97a50115a146a7f1bd-1"/>
-          <w:p>
-            <w:pPr>
-              <w:pStyle w:val="Compact"/>
-              <w:jc w:val="center"/>
-            </w:pPr>
-            <w:bookmarkStart w:id="23" w:name="fig-539a35d47e664c97a50115a146a7f1bd-1"/>
-            <w:r>
-              <w:drawing>
-                <wp:inline>
-                  <wp:extent cx="5943600" cy="8229600"/>
-                  <wp:effectExtent b="0" l="0" r="0" t="0"/>
-                  <wp:docPr descr=" " title="" id="21" name="Picture"/>
-                  <a:graphic>
-                    <a:graphicData uri="http://schemas.openxmlformats.org/drawingml/2006/picture">
-                      <pic:pic>
-                        <pic:nvPicPr>
-                          <pic:cNvPr descr="images/platform_sngl_01.png" id="22" name="Picture"/>
-                          <pic:cNvPicPr>
-                            <a:picLocks noChangeArrowheads="1" noChangeAspect="1"/>
-                          </pic:cNvPicPr>
-                        </pic:nvPicPr>
-                        <pic:blipFill>
-                          <a:blip r:embed="rId20"/>
-                          <a:stretch>
-                            <a:fillRect/>
-                          </a:stretch>
-                        </pic:blipFill>
-                        <pic:spPr bwMode="auto">
-                          <a:xfrm>
-                            <a:off x="0" y="0"/>
-                            <a:ext cx="5943600" cy="8229600"/>
-                          </a:xfrm>
-                          <a:prstGeom prst="rect">
-                            <a:avLst/>
-                          </a:prstGeom>
-                          <a:noFill/>
-                          <a:ln w="9525">
-                            <a:noFill/>
-                            <a:headEnd/>
-                            <a:tailEnd/>
-                          </a:ln>
-                        </pic:spPr>
-                      </pic:pic>
-                    </a:graphicData>
-                  </a:graphic>
-                </wp:inline>
-              </w:drawing>
-            </w:r>
-            <w:bookmarkEnd w:id="23"/>
-          </w:p>
-          <w:p>
-            <w:pPr>
-              <w:jc w:val="center"/>
-            </w:pPr>
-            <w:pPr>
-              <w:jc w:val="start"/>
-              <w:spacing w:before="200"/>
-              <w:pStyle w:val="ImageCaption"/>
-            </w:pPr>
-            <w:r>
-              <w:t xml:space="preserve"> </w:t>
-            </w:r>
-          </w:p>
-          <w:bookmarkEnd w:id="24"/>
-        </w:tc>
-      </w:tr>
-    </w:tbl>
-    <w:bookmarkEnd w:id="25"/>
-    <w:bookmarkStart w:id="31" w:name="step-2"/>
+    <w:p>
+      <w:pPr>
+        <w:pStyle w:val="FirstParagraph"/>
+      </w:pPr>
+      <w:r>
+        <w:drawing>
+          <wp:inline>
+            <wp:extent cx="5943600" cy="8229600"/>
+            <wp:effectExtent b="0" l="0" r="0" t="0"/>
+            <wp:docPr descr="" title="" id="21" name="Picture"/>
+            <a:graphic>
+              <a:graphicData uri="http://schemas.openxmlformats.org/drawingml/2006/picture">
+                <pic:pic>
+                  <pic:nvPicPr>
+                    <pic:cNvPr descr="images/platform_sngl_01.png" id="22" name="Picture"/>
+                    <pic:cNvPicPr>
+                      <a:picLocks noChangeArrowheads="1" noChangeAspect="1"/>
+                    </pic:cNvPicPr>
+                  </pic:nvPicPr>
+                  <pic:blipFill>
+                    <a:blip r:embed="rId20"/>
+                    <a:stretch>
+                      <a:fillRect/>
+                    </a:stretch>
+                  </pic:blipFill>
+                  <pic:spPr bwMode="auto">
+                    <a:xfrm>
+                      <a:off x="0" y="0"/>
+                      <a:ext cx="5943600" cy="8229600"/>
+                    </a:xfrm>
+                    <a:prstGeom prst="rect">
+                      <a:avLst/>
+                    </a:prstGeom>
+                    <a:noFill/>
+                    <a:ln w="9525">
+                      <a:noFill/>
+                      <a:headEnd/>
+                      <a:tailEnd/>
+                    </a:ln>
+                  </pic:spPr>
+                </pic:pic>
+              </a:graphicData>
+            </a:graphic>
+          </wp:inline>
+        </w:drawing>
+      </w:r>
+    </w:p>
+    <w:bookmarkEnd w:id="23"/>
+    <w:bookmarkStart w:id="27" w:name="step-2"/>
     <w:p>
       <w:pPr>
         <w:pStyle w:val="Heading2"/>
@@ -371,7 +337,7 @@
         <w:br/>
       </w:r>
       <w:r>
-        <w:t xml:space="preserve">— nail these 2x6 together 8 places, centered vertically</w:t>
+        <w:t xml:space="preserve">— nail these 2x6 together 4 places at each end of frame, centered vertically</w:t>
       </w:r>
     </w:p>
     <w:p>
@@ -382,17 +348,6 @@
         </w:numPr>
       </w:pPr>
       <w:r>
-        <w:t xml:space="preserve">Put in all the inner 2X6 joists</w:t>
-      </w:r>
-    </w:p>
-    <w:p>
-      <w:pPr>
-        <w:numPr>
-          <w:ilvl w:val="0"/>
-          <w:numId w:val="1003"/>
-        </w:numPr>
-      </w:pPr>
-      <w:r>
         <w:t xml:space="preserve">Team leader</w:t>
       </w:r>
       <w:r>
@@ -419,208 +374,150 @@
         <w:br w:type="page"/>
       </w:r>
     </w:p>
-    <w:tbl>
-      <w:tblPr>
-        <w:tblStyle w:val="Table"/>
-        <w:tblW w:type="pct" w:w="5000"/>
-        <w:tblLayout w:type="fixed"/>
-        <w:tblLook w:firstRow="0" w:lastRow="0" w:firstColumn="0" w:lastColumn="0" w:noHBand="0" w:noVBand="0" w:val="0000"/>
-      </w:tblPr>
-      <w:tblGrid>
-        <w:gridCol w:w="7920"/>
-      </w:tblGrid>
-      <w:tr>
-        <w:tc>
-          <w:tcPr/>
-          <w:bookmarkStart w:id="30" w:name="fig-539a35d47e664c97a50115a146a7f1bd-2"/>
-          <w:p>
-            <w:pPr>
-              <w:pStyle w:val="Compact"/>
-              <w:jc w:val="center"/>
-            </w:pPr>
-            <w:bookmarkStart w:id="29" w:name="fig-539a35d47e664c97a50115a146a7f1bd-2"/>
-            <w:r>
-              <w:drawing>
-                <wp:inline>
-                  <wp:extent cx="5943600" cy="8229600"/>
-                  <wp:effectExtent b="0" l="0" r="0" t="0"/>
-                  <wp:docPr descr=" " title="" id="27" name="Picture"/>
-                  <a:graphic>
-                    <a:graphicData uri="http://schemas.openxmlformats.org/drawingml/2006/picture">
-                      <pic:pic>
-                        <pic:nvPicPr>
-                          <pic:cNvPr descr="images/platform_sngl_02.png" id="28" name="Picture"/>
-                          <pic:cNvPicPr>
-                            <a:picLocks noChangeArrowheads="1" noChangeAspect="1"/>
-                          </pic:cNvPicPr>
-                        </pic:nvPicPr>
-                        <pic:blipFill>
-                          <a:blip r:embed="rId26"/>
-                          <a:stretch>
-                            <a:fillRect/>
-                          </a:stretch>
-                        </pic:blipFill>
-                        <pic:spPr bwMode="auto">
-                          <a:xfrm>
-                            <a:off x="0" y="0"/>
-                            <a:ext cx="5943600" cy="8229600"/>
-                          </a:xfrm>
-                          <a:prstGeom prst="rect">
-                            <a:avLst/>
-                          </a:prstGeom>
-                          <a:noFill/>
-                          <a:ln w="9525">
-                            <a:noFill/>
-                            <a:headEnd/>
-                            <a:tailEnd/>
-                          </a:ln>
-                        </pic:spPr>
-                      </pic:pic>
-                    </a:graphicData>
-                  </a:graphic>
-                </wp:inline>
-              </w:drawing>
-            </w:r>
-            <w:bookmarkEnd w:id="29"/>
-          </w:p>
-          <w:p>
-            <w:pPr>
-              <w:jc w:val="center"/>
-            </w:pPr>
-            <w:pPr>
-              <w:jc w:val="start"/>
-              <w:spacing w:before="200"/>
-              <w:pStyle w:val="ImageCaption"/>
-            </w:pPr>
-            <w:r>
-              <w:t xml:space="preserve"> </w:t>
-            </w:r>
-          </w:p>
-          <w:bookmarkEnd w:id="30"/>
-        </w:tc>
-      </w:tr>
-    </w:tbl>
+    <w:p>
+      <w:pPr>
+        <w:pStyle w:val="FirstParagraph"/>
+      </w:pPr>
+      <w:r>
+        <w:drawing>
+          <wp:inline>
+            <wp:extent cx="5943600" cy="8229600"/>
+            <wp:effectExtent b="0" l="0" r="0" t="0"/>
+            <wp:docPr descr="" title="" id="25" name="Picture"/>
+            <a:graphic>
+              <a:graphicData uri="http://schemas.openxmlformats.org/drawingml/2006/picture">
+                <pic:pic>
+                  <pic:nvPicPr>
+                    <pic:cNvPr descr="images/platform_sngl_02.png" id="26" name="Picture"/>
+                    <pic:cNvPicPr>
+                      <a:picLocks noChangeArrowheads="1" noChangeAspect="1"/>
+                    </pic:cNvPicPr>
+                  </pic:nvPicPr>
+                  <pic:blipFill>
+                    <a:blip r:embed="rId24"/>
+                    <a:stretch>
+                      <a:fillRect/>
+                    </a:stretch>
+                  </pic:blipFill>
+                  <pic:spPr bwMode="auto">
+                    <a:xfrm>
+                      <a:off x="0" y="0"/>
+                      <a:ext cx="5943600" cy="8229600"/>
+                    </a:xfrm>
+                    <a:prstGeom prst="rect">
+                      <a:avLst/>
+                    </a:prstGeom>
+                    <a:noFill/>
+                    <a:ln w="9525">
+                      <a:noFill/>
+                      <a:headEnd/>
+                      <a:tailEnd/>
+                    </a:ln>
+                  </pic:spPr>
+                </pic:pic>
+              </a:graphicData>
+            </a:graphic>
+          </wp:inline>
+        </w:drawing>
+      </w:r>
+    </w:p>
+    <w:bookmarkEnd w:id="27"/>
+    <w:bookmarkStart w:id="31" w:name="step-3"/>
+    <w:p>
+      <w:pPr>
+        <w:pStyle w:val="Heading2"/>
+      </w:pPr>
+      <w:r>
+        <w:t xml:space="preserve">Step 3</w:t>
+      </w:r>
+    </w:p>
+    <w:p>
+      <w:pPr>
+        <w:numPr>
+          <w:ilvl w:val="0"/>
+          <w:numId w:val="1004"/>
+        </w:numPr>
+      </w:pPr>
+      <w:r>
+        <w:t xml:space="preserve">Put in all the inner 2x6 joists</w:t>
+      </w:r>
+    </w:p>
+    <w:p>
+      <w:pPr>
+        <w:numPr>
+          <w:ilvl w:val="0"/>
+          <w:numId w:val="1004"/>
+        </w:numPr>
+      </w:pPr>
+      <w:r>
+        <w:t xml:space="preserve">Put 3 nails in a vertical line on each end of each joist</w:t>
+      </w:r>
+      <w:r>
+        <w:br/>
+      </w:r>
+      <w:r>
+        <w:t xml:space="preserve">— make sure joists are flush with side rail before nailing</w:t>
+      </w:r>
+    </w:p>
+    <w:p>
+      <w:r>
+        <w:br w:type="page"/>
+      </w:r>
+    </w:p>
+    <w:p>
+      <w:pPr>
+        <w:pStyle w:val="FirstParagraph"/>
+      </w:pPr>
+      <w:r>
+        <w:drawing>
+          <wp:inline>
+            <wp:extent cx="5943600" cy="8229600"/>
+            <wp:effectExtent b="0" l="0" r="0" t="0"/>
+            <wp:docPr descr="" title="" id="29" name="Picture"/>
+            <a:graphic>
+              <a:graphicData uri="http://schemas.openxmlformats.org/drawingml/2006/picture">
+                <pic:pic>
+                  <pic:nvPicPr>
+                    <pic:cNvPr descr="images/platform_sngl_03.png" id="30" name="Picture"/>
+                    <pic:cNvPicPr>
+                      <a:picLocks noChangeArrowheads="1" noChangeAspect="1"/>
+                    </pic:cNvPicPr>
+                  </pic:nvPicPr>
+                  <pic:blipFill>
+                    <a:blip r:embed="rId28"/>
+                    <a:stretch>
+                      <a:fillRect/>
+                    </a:stretch>
+                  </pic:blipFill>
+                  <pic:spPr bwMode="auto">
+                    <a:xfrm>
+                      <a:off x="0" y="0"/>
+                      <a:ext cx="5943600" cy="8229600"/>
+                    </a:xfrm>
+                    <a:prstGeom prst="rect">
+                      <a:avLst/>
+                    </a:prstGeom>
+                    <a:noFill/>
+                    <a:ln w="9525">
+                      <a:noFill/>
+                      <a:headEnd/>
+                      <a:tailEnd/>
+                    </a:ln>
+                  </pic:spPr>
+                </pic:pic>
+              </a:graphicData>
+            </a:graphic>
+          </wp:inline>
+        </w:drawing>
+      </w:r>
+    </w:p>
     <w:bookmarkEnd w:id="31"/>
-    <w:bookmarkStart w:id="37" w:name="step-3"/>
+    <w:bookmarkStart w:id="35" w:name="step-4"/>
     <w:p>
       <w:pPr>
         <w:pStyle w:val="Heading2"/>
       </w:pPr>
       <w:r>
-        <w:t xml:space="preserve">Step 3</w:t>
-      </w:r>
-    </w:p>
-    <w:p>
-      <w:pPr>
-        <w:pStyle w:val="Compact"/>
-        <w:numPr>
-          <w:ilvl w:val="0"/>
-          <w:numId w:val="1004"/>
-        </w:numPr>
-      </w:pPr>
-      <w:r>
-        <w:t xml:space="preserve">Put 3 nails in a vertical line on both ends of each stud</w:t>
-      </w:r>
-      <w:r>
-        <w:br/>
-      </w:r>
-      <w:r>
-        <w:t xml:space="preserve">— make sure studs are flush before nailing</w:t>
-      </w:r>
-    </w:p>
-    <w:p>
-      <w:r>
-        <w:br w:type="page"/>
-      </w:r>
-    </w:p>
-    <w:tbl>
-      <w:tblPr>
-        <w:tblStyle w:val="Table"/>
-        <w:tblW w:type="pct" w:w="5000"/>
-        <w:tblLayout w:type="fixed"/>
-        <w:tblLook w:firstRow="0" w:lastRow="0" w:firstColumn="0" w:lastColumn="0" w:noHBand="0" w:noVBand="0" w:val="0000"/>
-      </w:tblPr>
-      <w:tblGrid>
-        <w:gridCol w:w="7920"/>
-      </w:tblGrid>
-      <w:tr>
-        <w:tc>
-          <w:tcPr/>
-          <w:bookmarkStart w:id="36" w:name="fig-539a35d47e664c97a50115a146a7f1bd-3"/>
-          <w:p>
-            <w:pPr>
-              <w:pStyle w:val="Compact"/>
-              <w:jc w:val="center"/>
-            </w:pPr>
-            <w:bookmarkStart w:id="35" w:name="fig-539a35d47e664c97a50115a146a7f1bd-3"/>
-            <w:r>
-              <w:drawing>
-                <wp:inline>
-                  <wp:extent cx="5943600" cy="8229600"/>
-                  <wp:effectExtent b="0" l="0" r="0" t="0"/>
-                  <wp:docPr descr=" " title="" id="33" name="Picture"/>
-                  <a:graphic>
-                    <a:graphicData uri="http://schemas.openxmlformats.org/drawingml/2006/picture">
-                      <pic:pic>
-                        <pic:nvPicPr>
-                          <pic:cNvPr descr="images/platform_sngl_03.png" id="34" name="Picture"/>
-                          <pic:cNvPicPr>
-                            <a:picLocks noChangeArrowheads="1" noChangeAspect="1"/>
-                          </pic:cNvPicPr>
-                        </pic:nvPicPr>
-                        <pic:blipFill>
-                          <a:blip r:embed="rId32"/>
-                          <a:stretch>
-                            <a:fillRect/>
-                          </a:stretch>
-                        </pic:blipFill>
-                        <pic:spPr bwMode="auto">
-                          <a:xfrm>
-                            <a:off x="0" y="0"/>
-                            <a:ext cx="5943600" cy="8229600"/>
-                          </a:xfrm>
-                          <a:prstGeom prst="rect">
-                            <a:avLst/>
-                          </a:prstGeom>
-                          <a:noFill/>
-                          <a:ln w="9525">
-                            <a:noFill/>
-                            <a:headEnd/>
-                            <a:tailEnd/>
-                          </a:ln>
-                        </pic:spPr>
-                      </pic:pic>
-                    </a:graphicData>
-                  </a:graphic>
-                </wp:inline>
-              </w:drawing>
-            </w:r>
-            <w:bookmarkEnd w:id="35"/>
-          </w:p>
-          <w:p>
-            <w:pPr>
-              <w:jc w:val="center"/>
-            </w:pPr>
-            <w:pPr>
-              <w:jc w:val="start"/>
-              <w:spacing w:before="200"/>
-              <w:pStyle w:val="ImageCaption"/>
-            </w:pPr>
-            <w:r>
-              <w:t xml:space="preserve"> </w:t>
-            </w:r>
-          </w:p>
-          <w:bookmarkEnd w:id="36"/>
-        </w:tc>
-      </w:tr>
-    </w:tbl>
-    <w:bookmarkEnd w:id="37"/>
-    <w:bookmarkStart w:id="43" w:name="step-4"/>
-    <w:p>
-      <w:pPr>
-        <w:pStyle w:val="Heading2"/>
-      </w:pPr>
-      <w:r>
         <w:t xml:space="preserve">Step 4</w:t>
       </w:r>
     </w:p>
@@ -676,47 +573,47 @@
         <w:t xml:space="preserve">skids, and the two alignment blocks should be flush with the skid tops.</w:t>
       </w:r>
       <w:r>
+        <w:br/>
+      </w:r>
+      <w:r>
+        <w:t xml:space="preserve">— The skids should both be between the two alignment blocks.</w:t>
+      </w:r>
+    </w:p>
+    <w:p>
+      <w:pPr>
+        <w:numPr>
+          <w:ilvl w:val="0"/>
+          <w:numId w:val="1005"/>
+        </w:numPr>
+      </w:pPr>
+      <w:r>
+        <w:t xml:space="preserve">Measure diagonally from jig corner to corner and adjust so that the jig is square.</w:t>
+      </w:r>
+    </w:p>
+    <w:p>
+      <w:pPr>
+        <w:numPr>
+          <w:ilvl w:val="0"/>
+          <w:numId w:val="1005"/>
+        </w:numPr>
+      </w:pPr>
+      <w:r>
+        <w:t xml:space="preserve">Pry the frame out of the framing jig, and lift the frame onto the pre-cut skids</w:t>
+      </w:r>
+      <w:r>
+        <w:br/>
+      </w:r>
+      <w:r>
+        <w:t xml:space="preserve">— At the front, the frame should be up against the alignment jig crossbar. At</w:t>
+      </w:r>
+      <w:r>
         <w:t xml:space="preserve"> </w:t>
       </w:r>
       <w:r>
-        <w:t xml:space="preserve">— The skids should both be between the two alignment blocks.</w:t>
-      </w:r>
-    </w:p>
-    <w:p>
-      <w:pPr>
-        <w:numPr>
-          <w:ilvl w:val="0"/>
-          <w:numId w:val="1005"/>
-        </w:numPr>
-      </w:pPr>
-      <w:r>
-        <w:t xml:space="preserve">Measure diagonally from jig corner to corner and adjust so that the jig is square.</w:t>
-      </w:r>
-    </w:p>
-    <w:p>
-      <w:pPr>
-        <w:numPr>
-          <w:ilvl w:val="0"/>
-          <w:numId w:val="1005"/>
-        </w:numPr>
-      </w:pPr>
-      <w:r>
-        <w:t xml:space="preserve">Pry the frame out of the jig, and lift the frame onto the pre-cut skids</w:t>
-      </w:r>
-      <w:r>
-        <w:br/>
-      </w:r>
-      <w:r>
-        <w:t xml:space="preserve">— At the front, the frame should be up against the jig crossbar. At</w:t>
-      </w:r>
-      <w:r>
-        <w:t xml:space="preserve"> </w:t>
-      </w:r>
-      <w:r>
         <w:t xml:space="preserve">all four corners, the frame should fit into the metal angles.</w:t>
       </w:r>
       <w:r>
-        <w:t xml:space="preserve"> </w:t>
+        <w:br/>
       </w:r>
       <w:r>
         <w:t xml:space="preserve">— Verify that the skids do not stick out beyond the back of the frame.</w:t>
@@ -772,95 +669,245 @@
         <w:br w:type="page"/>
       </w:r>
     </w:p>
-    <w:tbl>
-      <w:tblPr>
-        <w:tblStyle w:val="Table"/>
-        <w:tblW w:type="pct" w:w="5000"/>
-        <w:tblLayout w:type="fixed"/>
-        <w:tblLook w:firstRow="0" w:lastRow="0" w:firstColumn="0" w:lastColumn="0" w:noHBand="0" w:noVBand="0" w:val="0000"/>
-      </w:tblPr>
-      <w:tblGrid>
-        <w:gridCol w:w="7920"/>
-      </w:tblGrid>
-      <w:tr>
-        <w:tc>
-          <w:tcPr/>
-          <w:bookmarkStart w:id="42" w:name="fig-539a35d47e664c97a50115a146a7f1bd-4"/>
-          <w:p>
-            <w:pPr>
-              <w:pStyle w:val="Compact"/>
-              <w:jc w:val="center"/>
-            </w:pPr>
-            <w:bookmarkStart w:id="41" w:name="fig-539a35d47e664c97a50115a146a7f1bd-4"/>
-            <w:r>
-              <w:drawing>
-                <wp:inline>
-                  <wp:extent cx="5943600" cy="8229600"/>
-                  <wp:effectExtent b="0" l="0" r="0" t="0"/>
-                  <wp:docPr descr=" " title="" id="39" name="Picture"/>
-                  <a:graphic>
-                    <a:graphicData uri="http://schemas.openxmlformats.org/drawingml/2006/picture">
-                      <pic:pic>
-                        <pic:nvPicPr>
-                          <pic:cNvPr descr="images/platform_sngl_04.png" id="40" name="Picture"/>
-                          <pic:cNvPicPr>
-                            <a:picLocks noChangeArrowheads="1" noChangeAspect="1"/>
-                          </pic:cNvPicPr>
-                        </pic:nvPicPr>
-                        <pic:blipFill>
-                          <a:blip r:embed="rId38"/>
-                          <a:stretch>
-                            <a:fillRect/>
-                          </a:stretch>
-                        </pic:blipFill>
-                        <pic:spPr bwMode="auto">
-                          <a:xfrm>
-                            <a:off x="0" y="0"/>
-                            <a:ext cx="5943600" cy="8229600"/>
-                          </a:xfrm>
-                          <a:prstGeom prst="rect">
-                            <a:avLst/>
-                          </a:prstGeom>
-                          <a:noFill/>
-                          <a:ln w="9525">
-                            <a:noFill/>
-                            <a:headEnd/>
-                            <a:tailEnd/>
-                          </a:ln>
-                        </pic:spPr>
-                      </pic:pic>
-                    </a:graphicData>
-                  </a:graphic>
-                </wp:inline>
-              </w:drawing>
-            </w:r>
-            <w:bookmarkEnd w:id="41"/>
-          </w:p>
-          <w:p>
-            <w:pPr>
-              <w:jc w:val="center"/>
-            </w:pPr>
-            <w:pPr>
-              <w:jc w:val="start"/>
-              <w:spacing w:before="200"/>
-              <w:pStyle w:val="ImageCaption"/>
-            </w:pPr>
-            <w:r>
-              <w:t xml:space="preserve"> </w:t>
-            </w:r>
-          </w:p>
-          <w:bookmarkEnd w:id="42"/>
-        </w:tc>
-      </w:tr>
-    </w:tbl>
+    <w:p>
+      <w:pPr>
+        <w:pStyle w:val="FirstParagraph"/>
+      </w:pPr>
+      <w:r>
+        <w:drawing>
+          <wp:inline>
+            <wp:extent cx="5943600" cy="8229600"/>
+            <wp:effectExtent b="0" l="0" r="0" t="0"/>
+            <wp:docPr descr="" title="" id="33" name="Picture"/>
+            <a:graphic>
+              <a:graphicData uri="http://schemas.openxmlformats.org/drawingml/2006/picture">
+                <pic:pic>
+                  <pic:nvPicPr>
+                    <pic:cNvPr descr="images/platform_sngl_04.png" id="34" name="Picture"/>
+                    <pic:cNvPicPr>
+                      <a:picLocks noChangeArrowheads="1" noChangeAspect="1"/>
+                    </pic:cNvPicPr>
+                  </pic:nvPicPr>
+                  <pic:blipFill>
+                    <a:blip r:embed="rId32"/>
+                    <a:stretch>
+                      <a:fillRect/>
+                    </a:stretch>
+                  </pic:blipFill>
+                  <pic:spPr bwMode="auto">
+                    <a:xfrm>
+                      <a:off x="0" y="0"/>
+                      <a:ext cx="5943600" cy="8229600"/>
+                    </a:xfrm>
+                    <a:prstGeom prst="rect">
+                      <a:avLst/>
+                    </a:prstGeom>
+                    <a:noFill/>
+                    <a:ln w="9525">
+                      <a:noFill/>
+                      <a:headEnd/>
+                      <a:tailEnd/>
+                    </a:ln>
+                  </pic:spPr>
+                </pic:pic>
+              </a:graphicData>
+            </a:graphic>
+          </wp:inline>
+        </w:drawing>
+      </w:r>
+    </w:p>
+    <w:bookmarkEnd w:id="35"/>
+    <w:bookmarkStart w:id="39" w:name="step-5"/>
+    <w:p>
+      <w:pPr>
+        <w:pStyle w:val="Heading2"/>
+      </w:pPr>
+      <w:r>
+        <w:t xml:space="preserve">Step 5</w:t>
+      </w:r>
+    </w:p>
+    <w:p>
+      <w:pPr>
+        <w:pStyle w:val="Compact"/>
+        <w:numPr>
+          <w:ilvl w:val="0"/>
+          <w:numId w:val="1006"/>
+        </w:numPr>
+      </w:pPr>
+      <w:r>
+        <w:t xml:space="preserve">Team Leader</w:t>
+      </w:r>
+      <w:r>
+        <w:br/>
+      </w:r>
+      <w:r>
+        <w:t xml:space="preserve">— make an X where the metal brackets should go</w:t>
+      </w:r>
+      <w:r>
+        <w:br/>
+      </w:r>
+      <w:r>
+        <w:t xml:space="preserve">— FOLLOW LOCATIONS on DIAGRAM</w:t>
+      </w:r>
+      <w:r>
+        <w:br/>
+      </w:r>
+      <w:r>
+        <w:t xml:space="preserve">— alternate inside of the skid and outside of the skid all the way to the rear</w:t>
+      </w:r>
+      <w:r>
+        <w:br/>
+      </w:r>
+      <w:r>
+        <w:t xml:space="preserve">— make sure to make a mark on the inside of the double joist at the rear.</w:t>
+      </w:r>
+    </w:p>
+    <w:p>
+      <w:r>
+        <w:br w:type="page"/>
+      </w:r>
+    </w:p>
+    <w:p>
+      <w:pPr>
+        <w:pStyle w:val="FirstParagraph"/>
+      </w:pPr>
+      <w:r>
+        <w:drawing>
+          <wp:inline>
+            <wp:extent cx="5943600" cy="8229600"/>
+            <wp:effectExtent b="0" l="0" r="0" t="0"/>
+            <wp:docPr descr="" title="" id="37" name="Picture"/>
+            <a:graphic>
+              <a:graphicData uri="http://schemas.openxmlformats.org/drawingml/2006/picture">
+                <pic:pic>
+                  <pic:nvPicPr>
+                    <pic:cNvPr descr="images/platform_sngl_05.png" id="38" name="Picture"/>
+                    <pic:cNvPicPr>
+                      <a:picLocks noChangeArrowheads="1" noChangeAspect="1"/>
+                    </pic:cNvPicPr>
+                  </pic:nvPicPr>
+                  <pic:blipFill>
+                    <a:blip r:embed="rId36"/>
+                    <a:stretch>
+                      <a:fillRect/>
+                    </a:stretch>
+                  </pic:blipFill>
+                  <pic:spPr bwMode="auto">
+                    <a:xfrm>
+                      <a:off x="0" y="0"/>
+                      <a:ext cx="5943600" cy="8229600"/>
+                    </a:xfrm>
+                    <a:prstGeom prst="rect">
+                      <a:avLst/>
+                    </a:prstGeom>
+                    <a:noFill/>
+                    <a:ln w="9525">
+                      <a:noFill/>
+                      <a:headEnd/>
+                      <a:tailEnd/>
+                    </a:ln>
+                  </pic:spPr>
+                </pic:pic>
+              </a:graphicData>
+            </a:graphic>
+          </wp:inline>
+        </w:drawing>
+      </w:r>
+    </w:p>
+    <w:bookmarkEnd w:id="39"/>
+    <w:bookmarkStart w:id="43" w:name="step-6"/>
+    <w:p>
+      <w:pPr>
+        <w:pStyle w:val="Heading2"/>
+      </w:pPr>
+      <w:r>
+        <w:t xml:space="preserve">Step 6</w:t>
+      </w:r>
+    </w:p>
+    <w:p>
+      <w:pPr>
+        <w:pStyle w:val="Compact"/>
+        <w:numPr>
+          <w:ilvl w:val="0"/>
+          <w:numId w:val="1007"/>
+        </w:numPr>
+      </w:pPr>
+      <w:r>
+        <w:t xml:space="preserve">At each X, screw in a metal bracket</w:t>
+      </w:r>
+      <w:r>
+        <w:br/>
+      </w:r>
+      <w:r>
+        <w:t xml:space="preserve">— use 6 small hexagonal screws for each metal bracket</w:t>
+      </w:r>
+      <w:r>
+        <w:br/>
+      </w:r>
+      <w:r>
+        <w:t xml:space="preserve">— 3 on the bottom 3 on the top, attaching the frame to the skids</w:t>
+      </w:r>
+    </w:p>
+    <w:p>
+      <w:r>
+        <w:br w:type="page"/>
+      </w:r>
+    </w:p>
+    <w:p>
+      <w:pPr>
+        <w:pStyle w:val="FirstParagraph"/>
+      </w:pPr>
+      <w:r>
+        <w:drawing>
+          <wp:inline>
+            <wp:extent cx="5943600" cy="8229600"/>
+            <wp:effectExtent b="0" l="0" r="0" t="0"/>
+            <wp:docPr descr="" title="" id="41" name="Picture"/>
+            <a:graphic>
+              <a:graphicData uri="http://schemas.openxmlformats.org/drawingml/2006/picture">
+                <pic:pic>
+                  <pic:nvPicPr>
+                    <pic:cNvPr descr="images/platform_sngl_06.png" id="42" name="Picture"/>
+                    <pic:cNvPicPr>
+                      <a:picLocks noChangeArrowheads="1" noChangeAspect="1"/>
+                    </pic:cNvPicPr>
+                  </pic:nvPicPr>
+                  <pic:blipFill>
+                    <a:blip r:embed="rId40"/>
+                    <a:stretch>
+                      <a:fillRect/>
+                    </a:stretch>
+                  </pic:blipFill>
+                  <pic:spPr bwMode="auto">
+                    <a:xfrm>
+                      <a:off x="0" y="0"/>
+                      <a:ext cx="5943600" cy="8229600"/>
+                    </a:xfrm>
+                    <a:prstGeom prst="rect">
+                      <a:avLst/>
+                    </a:prstGeom>
+                    <a:noFill/>
+                    <a:ln w="9525">
+                      <a:noFill/>
+                      <a:headEnd/>
+                      <a:tailEnd/>
+                    </a:ln>
+                  </pic:spPr>
+                </pic:pic>
+              </a:graphicData>
+            </a:graphic>
+          </wp:inline>
+        </w:drawing>
+      </w:r>
+    </w:p>
     <w:bookmarkEnd w:id="43"/>
-    <w:bookmarkStart w:id="49" w:name="step-5"/>
+    <w:bookmarkStart w:id="47" w:name="step-7"/>
     <w:p>
       <w:pPr>
         <w:pStyle w:val="Heading2"/>
       </w:pPr>
       <w:r>
-        <w:t xml:space="preserve">Step 5</w:t>
+        <w:t xml:space="preserve">Step 7</w:t>
       </w:r>
     </w:p>
     <w:p>
@@ -868,35 +915,53 @@
         <w:pStyle w:val="Compact"/>
         <w:numPr>
           <w:ilvl w:val="0"/>
-          <w:numId w:val="1006"/>
-        </w:numPr>
-      </w:pPr>
-      <w:r>
-        <w:t xml:space="preserve">Team Leader</w:t>
-      </w:r>
-      <w:r>
-        <w:br/>
-      </w:r>
-      <w:r>
-        <w:t xml:space="preserve">— make an X where the metal brackets should go</w:t>
-      </w:r>
-      <w:r>
-        <w:br/>
-      </w:r>
-      <w:r>
-        <w:t xml:space="preserve">— FOLLOW LOCATIONS on DIAGRAM</w:t>
-      </w:r>
-      <w:r>
-        <w:br/>
-      </w:r>
-      <w:r>
-        <w:t xml:space="preserve">— alternate inside of the skid and outside of the skid all the way to the back</w:t>
-      </w:r>
-      <w:r>
-        <w:br/>
-      </w:r>
-      <w:r>
-        <w:t xml:space="preserve">— make sure to make a mark on the inside stud of the double stud at the end.</w:t>
+          <w:numId w:val="1008"/>
+        </w:numPr>
+      </w:pPr>
+      <w:r>
+        <w:t xml:space="preserve">Place blocks labeled</w:t>
+      </w:r>
+      <w:r>
+        <w:t xml:space="preserve"> </w:t>
+      </w:r>
+      <w:r>
+        <w:t xml:space="preserve">“SAVE”</w:t>
+      </w:r>
+      <w:r>
+        <w:t xml:space="preserve"> </w:t>
+      </w:r>
+      <w:r>
+        <w:t xml:space="preserve">in each bay, except the front and back bays</w:t>
+      </w:r>
+      <w:r>
+        <w:br/>
+      </w:r>
+      <w:r>
+        <w:t xml:space="preserve">— on top of each skid, centered between the joists.</w:t>
+      </w:r>
+      <w:r>
+        <w:br/>
+      </w:r>
+      <w:r>
+        <w:t xml:space="preserve">— DO NOT NAIL</w:t>
+      </w:r>
+      <w:r>
+        <w:br/>
+      </w:r>
+      <w:r>
+        <w:t xml:space="preserve">— At each end, place the</w:t>
+      </w:r>
+      <w:r>
+        <w:t xml:space="preserve"> </w:t>
+      </w:r>
+      <w:r>
+        <w:t xml:space="preserve">“SAVE END”</w:t>
+      </w:r>
+      <w:r>
+        <w:t xml:space="preserve"> </w:t>
+      </w:r>
+      <w:r>
+        <w:t xml:space="preserve">blocks</w:t>
       </w:r>
     </w:p>
     <w:p>
@@ -904,362 +969,60 @@
         <w:br w:type="page"/>
       </w:r>
     </w:p>
-    <w:tbl>
-      <w:tblPr>
-        <w:tblStyle w:val="Table"/>
-        <w:tblW w:type="pct" w:w="5000"/>
-        <w:tblLayout w:type="fixed"/>
-        <w:tblLook w:firstRow="0" w:lastRow="0" w:firstColumn="0" w:lastColumn="0" w:noHBand="0" w:noVBand="0" w:val="0000"/>
-      </w:tblPr>
-      <w:tblGrid>
-        <w:gridCol w:w="7920"/>
-      </w:tblGrid>
-      <w:tr>
-        <w:tc>
-          <w:tcPr/>
-          <w:bookmarkStart w:id="48" w:name="fig-539a35d47e664c97a50115a146a7f1bd-5"/>
-          <w:p>
-            <w:pPr>
-              <w:pStyle w:val="Compact"/>
-              <w:jc w:val="center"/>
-            </w:pPr>
-            <w:bookmarkStart w:id="47" w:name="fig-539a35d47e664c97a50115a146a7f1bd-5"/>
-            <w:r>
-              <w:drawing>
-                <wp:inline>
-                  <wp:extent cx="5943600" cy="8229600"/>
-                  <wp:effectExtent b="0" l="0" r="0" t="0"/>
-                  <wp:docPr descr=" " title="" id="45" name="Picture"/>
-                  <a:graphic>
-                    <a:graphicData uri="http://schemas.openxmlformats.org/drawingml/2006/picture">
-                      <pic:pic>
-                        <pic:nvPicPr>
-                          <pic:cNvPr descr="images/platform_sngl_05.png" id="46" name="Picture"/>
-                          <pic:cNvPicPr>
-                            <a:picLocks noChangeArrowheads="1" noChangeAspect="1"/>
-                          </pic:cNvPicPr>
-                        </pic:nvPicPr>
-                        <pic:blipFill>
-                          <a:blip r:embed="rId44"/>
-                          <a:stretch>
-                            <a:fillRect/>
-                          </a:stretch>
-                        </pic:blipFill>
-                        <pic:spPr bwMode="auto">
-                          <a:xfrm>
-                            <a:off x="0" y="0"/>
-                            <a:ext cx="5943600" cy="8229600"/>
-                          </a:xfrm>
-                          <a:prstGeom prst="rect">
-                            <a:avLst/>
-                          </a:prstGeom>
-                          <a:noFill/>
-                          <a:ln w="9525">
-                            <a:noFill/>
-                            <a:headEnd/>
-                            <a:tailEnd/>
-                          </a:ln>
-                        </pic:spPr>
-                      </pic:pic>
-                    </a:graphicData>
-                  </a:graphic>
-                </wp:inline>
-              </w:drawing>
-            </w:r>
-            <w:bookmarkEnd w:id="47"/>
-          </w:p>
-          <w:p>
-            <w:pPr>
-              <w:jc w:val="center"/>
-            </w:pPr>
-            <w:pPr>
-              <w:jc w:val="start"/>
-              <w:spacing w:before="200"/>
-              <w:pStyle w:val="ImageCaption"/>
-            </w:pPr>
-            <w:r>
-              <w:t xml:space="preserve"> </w:t>
-            </w:r>
-          </w:p>
-          <w:bookmarkEnd w:id="48"/>
-        </w:tc>
-      </w:tr>
-    </w:tbl>
-    <w:bookmarkEnd w:id="49"/>
-    <w:bookmarkStart w:id="60" w:name="step-6"/>
+    <w:p>
+      <w:pPr>
+        <w:pStyle w:val="FirstParagraph"/>
+      </w:pPr>
+      <w:r>
+        <w:drawing>
+          <wp:inline>
+            <wp:extent cx="5943600" cy="8229600"/>
+            <wp:effectExtent b="0" l="0" r="0" t="0"/>
+            <wp:docPr descr="" title="" id="45" name="Picture"/>
+            <a:graphic>
+              <a:graphicData uri="http://schemas.openxmlformats.org/drawingml/2006/picture">
+                <pic:pic>
+                  <pic:nvPicPr>
+                    <pic:cNvPr descr="images/platform_sngl_07.png" id="46" name="Picture"/>
+                    <pic:cNvPicPr>
+                      <a:picLocks noChangeArrowheads="1" noChangeAspect="1"/>
+                    </pic:cNvPicPr>
+                  </pic:nvPicPr>
+                  <pic:blipFill>
+                    <a:blip r:embed="rId44"/>
+                    <a:stretch>
+                      <a:fillRect/>
+                    </a:stretch>
+                  </pic:blipFill>
+                  <pic:spPr bwMode="auto">
+                    <a:xfrm>
+                      <a:off x="0" y="0"/>
+                      <a:ext cx="5943600" cy="8229600"/>
+                    </a:xfrm>
+                    <a:prstGeom prst="rect">
+                      <a:avLst/>
+                    </a:prstGeom>
+                    <a:noFill/>
+                    <a:ln w="9525">
+                      <a:noFill/>
+                      <a:headEnd/>
+                      <a:tailEnd/>
+                    </a:ln>
+                  </pic:spPr>
+                </pic:pic>
+              </a:graphicData>
+            </a:graphic>
+          </wp:inline>
+        </w:drawing>
+      </w:r>
+    </w:p>
+    <w:bookmarkEnd w:id="47"/>
+    <w:bookmarkStart w:id="51" w:name="step-8"/>
     <w:p>
       <w:pPr>
         <w:pStyle w:val="Heading2"/>
       </w:pPr>
       <w:r>
-        <w:t xml:space="preserve">Step 6</w:t>
-      </w:r>
-    </w:p>
-    <w:p>
-      <w:pPr>
-        <w:pStyle w:val="Compact"/>
-        <w:numPr>
-          <w:ilvl w:val="0"/>
-          <w:numId w:val="1007"/>
-        </w:numPr>
-      </w:pPr>
-      <w:r>
-        <w:t xml:space="preserve">At each X, screw in a metal bracket</w:t>
-      </w:r>
-      <w:r>
-        <w:br/>
-      </w:r>
-      <w:r>
-        <w:t xml:space="preserve">— use 6 small hexagonal screws for each metal bracket</w:t>
-      </w:r>
-      <w:r>
-        <w:br/>
-      </w:r>
-      <w:r>
-        <w:t xml:space="preserve">— 3 on the bottom 3 on the top, attaching the frame to the skids</w:t>
-      </w:r>
-    </w:p>
-    <w:p>
-      <w:r>
-        <w:br w:type="page"/>
-      </w:r>
-    </w:p>
-    <w:tbl>
-      <w:tblPr>
-        <w:tblStyle w:val="Table"/>
-        <w:tblW w:type="pct" w:w="5000"/>
-        <w:tblLayout w:type="fixed"/>
-        <w:tblLook w:firstRow="0" w:lastRow="0" w:firstColumn="0" w:lastColumn="0" w:noHBand="0" w:noVBand="0" w:val="0000"/>
-      </w:tblPr>
-      <w:tblGrid>
-        <w:gridCol w:w="7920"/>
-      </w:tblGrid>
-      <w:tr>
-        <w:tc>
-          <w:tcPr/>
-          <w:bookmarkStart w:id="54" w:name="fig-539a35d47e664c97a50115a146a7f1bd-6"/>
-          <w:p>
-            <w:pPr>
-              <w:pStyle w:val="Compact"/>
-              <w:jc w:val="center"/>
-            </w:pPr>
-            <w:bookmarkStart w:id="53" w:name="fig-539a35d47e664c97a50115a146a7f1bd-6"/>
-            <w:r>
-              <w:drawing>
-                <wp:inline>
-                  <wp:extent cx="5943600" cy="8229600"/>
-                  <wp:effectExtent b="0" l="0" r="0" t="0"/>
-                  <wp:docPr descr=" " title="" id="51" name="Picture"/>
-                  <a:graphic>
-                    <a:graphicData uri="http://schemas.openxmlformats.org/drawingml/2006/picture">
-                      <pic:pic>
-                        <pic:nvPicPr>
-                          <pic:cNvPr descr="images/platform_sngl_06.png" id="52" name="Picture"/>
-                          <pic:cNvPicPr>
-                            <a:picLocks noChangeArrowheads="1" noChangeAspect="1"/>
-                          </pic:cNvPicPr>
-                        </pic:nvPicPr>
-                        <pic:blipFill>
-                          <a:blip r:embed="rId50"/>
-                          <a:stretch>
-                            <a:fillRect/>
-                          </a:stretch>
-                        </pic:blipFill>
-                        <pic:spPr bwMode="auto">
-                          <a:xfrm>
-                            <a:off x="0" y="0"/>
-                            <a:ext cx="5943600" cy="8229600"/>
-                          </a:xfrm>
-                          <a:prstGeom prst="rect">
-                            <a:avLst/>
-                          </a:prstGeom>
-                          <a:noFill/>
-                          <a:ln w="9525">
-                            <a:noFill/>
-                            <a:headEnd/>
-                            <a:tailEnd/>
-                          </a:ln>
-                        </pic:spPr>
-                      </pic:pic>
-                    </a:graphicData>
-                  </a:graphic>
-                </wp:inline>
-              </w:drawing>
-            </w:r>
-            <w:bookmarkEnd w:id="53"/>
-          </w:p>
-          <w:p>
-            <w:pPr>
-              <w:jc w:val="center"/>
-            </w:pPr>
-            <w:pPr>
-              <w:jc w:val="start"/>
-              <w:spacing w:before="200"/>
-              <w:pStyle w:val="ImageCaption"/>
-            </w:pPr>
-            <w:r>
-              <w:t xml:space="preserve"> </w:t>
-            </w:r>
-          </w:p>
-          <w:bookmarkEnd w:id="54"/>
-        </w:tc>
-      </w:tr>
-    </w:tbl>
-    <w:p>
-      <w:pPr>
-        <w:pStyle w:val="BodyText"/>
-      </w:pPr>
-      <w:r>
-        <w:t xml:space="preserve">## Step 7</w:t>
-      </w:r>
-    </w:p>
-    <w:p>
-      <w:pPr>
-        <w:pStyle w:val="Compact"/>
-        <w:numPr>
-          <w:ilvl w:val="0"/>
-          <w:numId w:val="1008"/>
-        </w:numPr>
-      </w:pPr>
-      <w:r>
-        <w:t xml:space="preserve">Place blocks labeled</w:t>
-      </w:r>
-      <w:r>
-        <w:t xml:space="preserve"> </w:t>
-      </w:r>
-      <w:r>
-        <w:t xml:space="preserve">“SAVE”</w:t>
-      </w:r>
-      <w:r>
-        <w:t xml:space="preserve"> </w:t>
-      </w:r>
-      <w:r>
-        <w:t xml:space="preserve">in each bay, except the front and back bays</w:t>
-      </w:r>
-      <w:r>
-        <w:br/>
-      </w:r>
-      <w:r>
-        <w:t xml:space="preserve">— on top of each skid, centered between the joists.</w:t>
-      </w:r>
-      <w:r>
-        <w:br/>
-      </w:r>
-      <w:r>
-        <w:t xml:space="preserve">— DO NOT NAIL</w:t>
-      </w:r>
-      <w:r>
-        <w:br/>
-      </w:r>
-      <w:r>
-        <w:t xml:space="preserve">— At each end, place the</w:t>
-      </w:r>
-      <w:r>
-        <w:t xml:space="preserve"> </w:t>
-      </w:r>
-      <w:r>
-        <w:t xml:space="preserve">“SAVE END”</w:t>
-      </w:r>
-      <w:r>
-        <w:t xml:space="preserve"> </w:t>
-      </w:r>
-      <w:r>
-        <w:t xml:space="preserve">blocks</w:t>
-      </w:r>
-    </w:p>
-    <w:p>
-      <w:r>
-        <w:br w:type="page"/>
-      </w:r>
-    </w:p>
-    <w:tbl>
-      <w:tblPr>
-        <w:tblStyle w:val="Table"/>
-        <w:tblW w:type="pct" w:w="5000"/>
-        <w:tblLayout w:type="fixed"/>
-        <w:tblLook w:firstRow="0" w:lastRow="0" w:firstColumn="0" w:lastColumn="0" w:noHBand="0" w:noVBand="0" w:val="0000"/>
-      </w:tblPr>
-      <w:tblGrid>
-        <w:gridCol w:w="7920"/>
-      </w:tblGrid>
-      <w:tr>
-        <w:tc>
-          <w:tcPr/>
-          <w:bookmarkStart w:id="59" w:name="fig-539a35d47e664c97a50115a146a7f1bd-7"/>
-          <w:p>
-            <w:pPr>
-              <w:pStyle w:val="Compact"/>
-              <w:jc w:val="center"/>
-            </w:pPr>
-            <w:bookmarkStart w:id="58" w:name="fig-539a35d47e664c97a50115a146a7f1bd-7"/>
-            <w:r>
-              <w:drawing>
-                <wp:inline>
-                  <wp:extent cx="5943600" cy="8229600"/>
-                  <wp:effectExtent b="0" l="0" r="0" t="0"/>
-                  <wp:docPr descr=" " title="" id="56" name="Picture"/>
-                  <a:graphic>
-                    <a:graphicData uri="http://schemas.openxmlformats.org/drawingml/2006/picture">
-                      <pic:pic>
-                        <pic:nvPicPr>
-                          <pic:cNvPr descr="images/platform_sngl_07.png" id="57" name="Picture"/>
-                          <pic:cNvPicPr>
-                            <a:picLocks noChangeArrowheads="1" noChangeAspect="1"/>
-                          </pic:cNvPicPr>
-                        </pic:nvPicPr>
-                        <pic:blipFill>
-                          <a:blip r:embed="rId55"/>
-                          <a:stretch>
-                            <a:fillRect/>
-                          </a:stretch>
-                        </pic:blipFill>
-                        <pic:spPr bwMode="auto">
-                          <a:xfrm>
-                            <a:off x="0" y="0"/>
-                            <a:ext cx="5943600" cy="8229600"/>
-                          </a:xfrm>
-                          <a:prstGeom prst="rect">
-                            <a:avLst/>
-                          </a:prstGeom>
-                          <a:noFill/>
-                          <a:ln w="9525">
-                            <a:noFill/>
-                            <a:headEnd/>
-                            <a:tailEnd/>
-                          </a:ln>
-                        </pic:spPr>
-                      </pic:pic>
-                    </a:graphicData>
-                  </a:graphic>
-                </wp:inline>
-              </w:drawing>
-            </w:r>
-            <w:bookmarkEnd w:id="58"/>
-          </w:p>
-          <w:p>
-            <w:pPr>
-              <w:jc w:val="center"/>
-            </w:pPr>
-            <w:pPr>
-              <w:jc w:val="start"/>
-              <w:spacing w:before="200"/>
-              <w:pStyle w:val="ImageCaption"/>
-            </w:pPr>
-            <w:r>
-              <w:t xml:space="preserve"> </w:t>
-            </w:r>
-          </w:p>
-          <w:bookmarkEnd w:id="59"/>
-        </w:tc>
-      </w:tr>
-    </w:tbl>
-    <w:bookmarkEnd w:id="60"/>
-    <w:bookmarkStart w:id="66" w:name="step-8"/>
-    <w:p>
-      <w:pPr>
-        <w:pStyle w:val="Heading2"/>
-      </w:pPr>
-      <w:r>
         <w:t xml:space="preserve">Step 8</w:t>
       </w:r>
     </w:p>
@@ -1271,7 +1034,7 @@
         </w:numPr>
       </w:pPr>
       <w:r>
-        <w:t xml:space="preserve">Put insulation foam pieces between each stud</w:t>
+        <w:t xml:space="preserve">Put insulation foam pieces between each joist</w:t>
       </w:r>
       <w:r>
         <w:br/>
@@ -1389,13 +1152,13 @@
         <w:t xml:space="preserve">— put lines to fill in at all the junctions between the foam and the joists.</w:t>
       </w:r>
       <w:r>
-        <w:t xml:space="preserve"> </w:t>
+        <w:br/>
       </w:r>
       <w:r>
         <w:t xml:space="preserve">— Start with tip of spray can at the middle, and pull towards you.</w:t>
       </w:r>
       <w:r>
-        <w:t xml:space="preserve"> </w:t>
+        <w:br/>
       </w:r>
       <w:r>
         <w:t xml:space="preserve">— DO NOT SET THE SPRAY CANS ON WORK STATIONS</w:t>
@@ -1406,89 +1169,55 @@
         <w:br w:type="page"/>
       </w:r>
     </w:p>
-    <w:tbl>
-      <w:tblPr>
-        <w:tblStyle w:val="Table"/>
-        <w:tblW w:type="pct" w:w="5000"/>
-        <w:tblLayout w:type="fixed"/>
-        <w:tblLook w:firstRow="0" w:lastRow="0" w:firstColumn="0" w:lastColumn="0" w:noHBand="0" w:noVBand="0" w:val="0000"/>
-      </w:tblPr>
-      <w:tblGrid>
-        <w:gridCol w:w="7920"/>
-      </w:tblGrid>
-      <w:tr>
-        <w:tc>
-          <w:tcPr/>
-          <w:bookmarkStart w:id="65" w:name="fig-539a35d47e664c97a50115a146a7f1bd-8"/>
-          <w:p>
-            <w:pPr>
-              <w:pStyle w:val="Compact"/>
-              <w:jc w:val="center"/>
-            </w:pPr>
-            <w:bookmarkStart w:id="64" w:name="fig-539a35d47e664c97a50115a146a7f1bd-8"/>
-            <w:r>
-              <w:drawing>
-                <wp:inline>
-                  <wp:extent cx="5943600" cy="8229600"/>
-                  <wp:effectExtent b="0" l="0" r="0" t="0"/>
-                  <wp:docPr descr=" " title="" id="62" name="Picture"/>
-                  <a:graphic>
-                    <a:graphicData uri="http://schemas.openxmlformats.org/drawingml/2006/picture">
-                      <pic:pic>
-                        <pic:nvPicPr>
-                          <pic:cNvPr descr="images/platform_sngl_08.png" id="63" name="Picture"/>
-                          <pic:cNvPicPr>
-                            <a:picLocks noChangeArrowheads="1" noChangeAspect="1"/>
-                          </pic:cNvPicPr>
-                        </pic:nvPicPr>
-                        <pic:blipFill>
-                          <a:blip r:embed="rId61"/>
-                          <a:stretch>
-                            <a:fillRect/>
-                          </a:stretch>
-                        </pic:blipFill>
-                        <pic:spPr bwMode="auto">
-                          <a:xfrm>
-                            <a:off x="0" y="0"/>
-                            <a:ext cx="5943600" cy="8229600"/>
-                          </a:xfrm>
-                          <a:prstGeom prst="rect">
-                            <a:avLst/>
-                          </a:prstGeom>
-                          <a:noFill/>
-                          <a:ln w="9525">
-                            <a:noFill/>
-                            <a:headEnd/>
-                            <a:tailEnd/>
-                          </a:ln>
-                        </pic:spPr>
-                      </pic:pic>
-                    </a:graphicData>
-                  </a:graphic>
-                </wp:inline>
-              </w:drawing>
-            </w:r>
-            <w:bookmarkEnd w:id="64"/>
-          </w:p>
-          <w:p>
-            <w:pPr>
-              <w:jc w:val="center"/>
-            </w:pPr>
-            <w:pPr>
-              <w:jc w:val="start"/>
-              <w:spacing w:before="200"/>
-              <w:pStyle w:val="ImageCaption"/>
-            </w:pPr>
-            <w:r>
-              <w:t xml:space="preserve"> </w:t>
-            </w:r>
-          </w:p>
-          <w:bookmarkEnd w:id="65"/>
-        </w:tc>
-      </w:tr>
-    </w:tbl>
-    <w:bookmarkEnd w:id="66"/>
-    <w:bookmarkStart w:id="72" w:name="step-9"/>
+    <w:p>
+      <w:pPr>
+        <w:pStyle w:val="FirstParagraph"/>
+      </w:pPr>
+      <w:r>
+        <w:drawing>
+          <wp:inline>
+            <wp:extent cx="5943600" cy="8229600"/>
+            <wp:effectExtent b="0" l="0" r="0" t="0"/>
+            <wp:docPr descr="" title="" id="49" name="Picture"/>
+            <a:graphic>
+              <a:graphicData uri="http://schemas.openxmlformats.org/drawingml/2006/picture">
+                <pic:pic>
+                  <pic:nvPicPr>
+                    <pic:cNvPr descr="images/platform_sngl_08.png" id="50" name="Picture"/>
+                    <pic:cNvPicPr>
+                      <a:picLocks noChangeArrowheads="1" noChangeAspect="1"/>
+                    </pic:cNvPicPr>
+                  </pic:nvPicPr>
+                  <pic:blipFill>
+                    <a:blip r:embed="rId48"/>
+                    <a:stretch>
+                      <a:fillRect/>
+                    </a:stretch>
+                  </pic:blipFill>
+                  <pic:spPr bwMode="auto">
+                    <a:xfrm>
+                      <a:off x="0" y="0"/>
+                      <a:ext cx="5943600" cy="8229600"/>
+                    </a:xfrm>
+                    <a:prstGeom prst="rect">
+                      <a:avLst/>
+                    </a:prstGeom>
+                    <a:noFill/>
+                    <a:ln w="9525">
+                      <a:noFill/>
+                      <a:headEnd/>
+                      <a:tailEnd/>
+                    </a:ln>
+                  </pic:spPr>
+                </pic:pic>
+              </a:graphicData>
+            </a:graphic>
+          </wp:inline>
+        </w:drawing>
+      </w:r>
+    </w:p>
+    <w:bookmarkEnd w:id="51"/>
+    <w:bookmarkStart w:id="55" w:name="step-9"/>
     <w:p>
       <w:pPr>
         <w:pStyle w:val="Heading2"/>
@@ -1511,7 +1240,7 @@
         <w:br/>
       </w:r>
       <w:r>
-        <w:t xml:space="preserve">— put Liquid Nails construction adhesive on each of the studs and along the top and bottom</w:t>
+        <w:t xml:space="preserve">— put Liquid Nails construction adhesive on each of the joists and along the side rails, only along the first 3 bays.</w:t>
       </w:r>
     </w:p>
     <w:p>
@@ -1567,7 +1296,7 @@
         </w:numPr>
       </w:pPr>
       <w:r>
-        <w:t xml:space="preserve">Put a chalk line at the intermediate studs</w:t>
+        <w:t xml:space="preserve">Put a chalk line at the intermediate joists</w:t>
       </w:r>
       <w:r>
         <w:br/>
@@ -1598,89 +1327,55 @@
         <w:br w:type="page"/>
       </w:r>
     </w:p>
-    <w:tbl>
-      <w:tblPr>
-        <w:tblStyle w:val="Table"/>
-        <w:tblW w:type="pct" w:w="5000"/>
-        <w:tblLayout w:type="fixed"/>
-        <w:tblLook w:firstRow="0" w:lastRow="0" w:firstColumn="0" w:lastColumn="0" w:noHBand="0" w:noVBand="0" w:val="0000"/>
-      </w:tblPr>
-      <w:tblGrid>
-        <w:gridCol w:w="7920"/>
-      </w:tblGrid>
-      <w:tr>
-        <w:tc>
-          <w:tcPr/>
-          <w:bookmarkStart w:id="71" w:name="fig-539a35d47e664c97a50115a146a7f1bd-9"/>
-          <w:p>
-            <w:pPr>
-              <w:pStyle w:val="Compact"/>
-              <w:jc w:val="center"/>
-            </w:pPr>
-            <w:bookmarkStart w:id="70" w:name="fig-539a35d47e664c97a50115a146a7f1bd-9"/>
-            <w:r>
-              <w:drawing>
-                <wp:inline>
-                  <wp:extent cx="5943600" cy="8229600"/>
-                  <wp:effectExtent b="0" l="0" r="0" t="0"/>
-                  <wp:docPr descr=" " title="" id="68" name="Picture"/>
-                  <a:graphic>
-                    <a:graphicData uri="http://schemas.openxmlformats.org/drawingml/2006/picture">
-                      <pic:pic>
-                        <pic:nvPicPr>
-                          <pic:cNvPr descr="images/platform_sngl_09.png" id="69" name="Picture"/>
-                          <pic:cNvPicPr>
-                            <a:picLocks noChangeArrowheads="1" noChangeAspect="1"/>
-                          </pic:cNvPicPr>
-                        </pic:nvPicPr>
-                        <pic:blipFill>
-                          <a:blip r:embed="rId67"/>
-                          <a:stretch>
-                            <a:fillRect/>
-                          </a:stretch>
-                        </pic:blipFill>
-                        <pic:spPr bwMode="auto">
-                          <a:xfrm>
-                            <a:off x="0" y="0"/>
-                            <a:ext cx="5943600" cy="8229600"/>
-                          </a:xfrm>
-                          <a:prstGeom prst="rect">
-                            <a:avLst/>
-                          </a:prstGeom>
-                          <a:noFill/>
-                          <a:ln w="9525">
-                            <a:noFill/>
-                            <a:headEnd/>
-                            <a:tailEnd/>
-                          </a:ln>
-                        </pic:spPr>
-                      </pic:pic>
-                    </a:graphicData>
-                  </a:graphic>
-                </wp:inline>
-              </w:drawing>
-            </w:r>
-            <w:bookmarkEnd w:id="70"/>
-          </w:p>
-          <w:p>
-            <w:pPr>
-              <w:jc w:val="center"/>
-            </w:pPr>
-            <w:pPr>
-              <w:jc w:val="start"/>
-              <w:spacing w:before="200"/>
-              <w:pStyle w:val="ImageCaption"/>
-            </w:pPr>
-            <w:r>
-              <w:t xml:space="preserve"> </w:t>
-            </w:r>
-          </w:p>
-          <w:bookmarkEnd w:id="71"/>
-        </w:tc>
-      </w:tr>
-    </w:tbl>
-    <w:bookmarkEnd w:id="72"/>
-    <w:bookmarkStart w:id="78" w:name="step-10"/>
+    <w:p>
+      <w:pPr>
+        <w:pStyle w:val="FirstParagraph"/>
+      </w:pPr>
+      <w:r>
+        <w:drawing>
+          <wp:inline>
+            <wp:extent cx="5943600" cy="8229600"/>
+            <wp:effectExtent b="0" l="0" r="0" t="0"/>
+            <wp:docPr descr="" title="" id="53" name="Picture"/>
+            <a:graphic>
+              <a:graphicData uri="http://schemas.openxmlformats.org/drawingml/2006/picture">
+                <pic:pic>
+                  <pic:nvPicPr>
+                    <pic:cNvPr descr="images/platform_sngl_09.png" id="54" name="Picture"/>
+                    <pic:cNvPicPr>
+                      <a:picLocks noChangeArrowheads="1" noChangeAspect="1"/>
+                    </pic:cNvPicPr>
+                  </pic:nvPicPr>
+                  <pic:blipFill>
+                    <a:blip r:embed="rId52"/>
+                    <a:stretch>
+                      <a:fillRect/>
+                    </a:stretch>
+                  </pic:blipFill>
+                  <pic:spPr bwMode="auto">
+                    <a:xfrm>
+                      <a:off x="0" y="0"/>
+                      <a:ext cx="5943600" cy="8229600"/>
+                    </a:xfrm>
+                    <a:prstGeom prst="rect">
+                      <a:avLst/>
+                    </a:prstGeom>
+                    <a:noFill/>
+                    <a:ln w="9525">
+                      <a:noFill/>
+                      <a:headEnd/>
+                      <a:tailEnd/>
+                    </a:ln>
+                  </pic:spPr>
+                </pic:pic>
+              </a:graphicData>
+            </a:graphic>
+          </wp:inline>
+        </w:drawing>
+      </w:r>
+    </w:p>
+    <w:bookmarkEnd w:id="55"/>
+    <w:bookmarkStart w:id="59" w:name="step-10"/>
     <w:p>
       <w:pPr>
         <w:pStyle w:val="Heading2"/>
@@ -1697,7 +1392,7 @@
         </w:numPr>
       </w:pPr>
       <w:r>
-        <w:t xml:space="preserve">Apply Liquid Nails construction adhesive to the studs that will be under the 2</w:t>
+        <w:t xml:space="preserve">Apply Liquid Nails construction adhesive to the joists that will be under the 2</w:t>
       </w:r>
       <w:r>
         <w:rPr>
@@ -1738,19 +1433,13 @@
         <w:br/>
       </w:r>
       <w:r>
-        <w:t xml:space="preserve">— use pivot point at the junction of the 2 panels.</w:t>
-      </w:r>
-      <w:r>
-        <w:t xml:space="preserve"> </w:t>
-      </w:r>
-      <w:r>
-        <w:t xml:space="preserve">— along the seam, nail about every 8 inches, slightly angled in towards the junction</w:t>
-      </w:r>
-      <w:r>
-        <w:t xml:space="preserve"> </w:t>
-      </w:r>
-      <w:r>
-        <w:t xml:space="preserve">line and alternate the sides of the junction line.</w:t>
+        <w:t xml:space="preserve">— use pivot point at the junction of the 2 panels</w:t>
+      </w:r>
+      <w:r>
+        <w:br/>
+      </w:r>
+      <w:r>
+        <w:t xml:space="preserve">— along the seam, nail about every 8 inches, slightly angled in towards the junction line</w:t>
       </w:r>
     </w:p>
     <w:p>
@@ -1769,89 +1458,55 @@
         <w:br w:type="page"/>
       </w:r>
     </w:p>
-    <w:tbl>
-      <w:tblPr>
-        <w:tblStyle w:val="Table"/>
-        <w:tblW w:type="pct" w:w="5000"/>
-        <w:tblLayout w:type="fixed"/>
-        <w:tblLook w:firstRow="0" w:lastRow="0" w:firstColumn="0" w:lastColumn="0" w:noHBand="0" w:noVBand="0" w:val="0000"/>
-      </w:tblPr>
-      <w:tblGrid>
-        <w:gridCol w:w="7920"/>
-      </w:tblGrid>
-      <w:tr>
-        <w:tc>
-          <w:tcPr/>
-          <w:bookmarkStart w:id="77" w:name="fig-539a35d47e664c97a50115a146a7f1bd-10"/>
-          <w:p>
-            <w:pPr>
-              <w:pStyle w:val="Compact"/>
-              <w:jc w:val="center"/>
-            </w:pPr>
-            <w:bookmarkStart w:id="76" w:name="fig-539a35d47e664c97a50115a146a7f1bd-10"/>
-            <w:r>
-              <w:drawing>
-                <wp:inline>
-                  <wp:extent cx="5943600" cy="8229600"/>
-                  <wp:effectExtent b="0" l="0" r="0" t="0"/>
-                  <wp:docPr descr=" " title="" id="74" name="Picture"/>
-                  <a:graphic>
-                    <a:graphicData uri="http://schemas.openxmlformats.org/drawingml/2006/picture">
-                      <pic:pic>
-                        <pic:nvPicPr>
-                          <pic:cNvPr descr="images/platform_sngl_10.png" id="75" name="Picture"/>
-                          <pic:cNvPicPr>
-                            <a:picLocks noChangeArrowheads="1" noChangeAspect="1"/>
-                          </pic:cNvPicPr>
-                        </pic:nvPicPr>
-                        <pic:blipFill>
-                          <a:blip r:embed="rId73"/>
-                          <a:stretch>
-                            <a:fillRect/>
-                          </a:stretch>
-                        </pic:blipFill>
-                        <pic:spPr bwMode="auto">
-                          <a:xfrm>
-                            <a:off x="0" y="0"/>
-                            <a:ext cx="5943600" cy="8229600"/>
-                          </a:xfrm>
-                          <a:prstGeom prst="rect">
-                            <a:avLst/>
-                          </a:prstGeom>
-                          <a:noFill/>
-                          <a:ln w="9525">
-                            <a:noFill/>
-                            <a:headEnd/>
-                            <a:tailEnd/>
-                          </a:ln>
-                        </pic:spPr>
-                      </pic:pic>
-                    </a:graphicData>
-                  </a:graphic>
-                </wp:inline>
-              </w:drawing>
-            </w:r>
-            <w:bookmarkEnd w:id="76"/>
-          </w:p>
-          <w:p>
-            <w:pPr>
-              <w:jc w:val="center"/>
-            </w:pPr>
-            <w:pPr>
-              <w:jc w:val="start"/>
-              <w:spacing w:before="200"/>
-              <w:pStyle w:val="ImageCaption"/>
-            </w:pPr>
-            <w:r>
-              <w:t xml:space="preserve"> </w:t>
-            </w:r>
-          </w:p>
-          <w:bookmarkEnd w:id="77"/>
-        </w:tc>
-      </w:tr>
-    </w:tbl>
-    <w:bookmarkEnd w:id="78"/>
-    <w:bookmarkStart w:id="84" w:name="step-11"/>
+    <w:p>
+      <w:pPr>
+        <w:pStyle w:val="FirstParagraph"/>
+      </w:pPr>
+      <w:r>
+        <w:drawing>
+          <wp:inline>
+            <wp:extent cx="5943600" cy="8229600"/>
+            <wp:effectExtent b="0" l="0" r="0" t="0"/>
+            <wp:docPr descr="" title="" id="57" name="Picture"/>
+            <a:graphic>
+              <a:graphicData uri="http://schemas.openxmlformats.org/drawingml/2006/picture">
+                <pic:pic>
+                  <pic:nvPicPr>
+                    <pic:cNvPr descr="images/platform_sngl_10.png" id="58" name="Picture"/>
+                    <pic:cNvPicPr>
+                      <a:picLocks noChangeArrowheads="1" noChangeAspect="1"/>
+                    </pic:cNvPicPr>
+                  </pic:nvPicPr>
+                  <pic:blipFill>
+                    <a:blip r:embed="rId56"/>
+                    <a:stretch>
+                      <a:fillRect/>
+                    </a:stretch>
+                  </pic:blipFill>
+                  <pic:spPr bwMode="auto">
+                    <a:xfrm>
+                      <a:off x="0" y="0"/>
+                      <a:ext cx="5943600" cy="8229600"/>
+                    </a:xfrm>
+                    <a:prstGeom prst="rect">
+                      <a:avLst/>
+                    </a:prstGeom>
+                    <a:noFill/>
+                    <a:ln w="9525">
+                      <a:noFill/>
+                      <a:headEnd/>
+                      <a:tailEnd/>
+                    </a:ln>
+                  </pic:spPr>
+                </pic:pic>
+              </a:graphicData>
+            </a:graphic>
+          </wp:inline>
+        </w:drawing>
+      </w:r>
+    </w:p>
+    <w:bookmarkEnd w:id="59"/>
+    <w:bookmarkStart w:id="63" w:name="step-11"/>
     <w:p>
       <w:pPr>
         <w:pStyle w:val="Heading2"/>
@@ -1868,7 +1523,7 @@
         </w:numPr>
       </w:pPr>
       <w:r>
-        <w:t xml:space="preserve">Apply Liquid Nails construction adhesive to the studs that will be under the 3</w:t>
+        <w:t xml:space="preserve">Apply Liquid Nails construction adhesive to the joists that will be under the 3</w:t>
       </w:r>
       <w:r>
         <w:rPr>
@@ -1909,30 +1564,121 @@
         <w:br/>
       </w:r>
       <w:r>
-        <w:t xml:space="preserve">— use pivot point at the junction of the 2 panels.</w:t>
+        <w:t xml:space="preserve">— use pivot point at the junction of the 2 panels</w:t>
+      </w:r>
+      <w:r>
+        <w:br/>
+      </w:r>
+      <w:r>
+        <w:t xml:space="preserve">— along the seam, nail about every 8 inches, slightly angled in towards the junction line</w:t>
+      </w:r>
+    </w:p>
+    <w:p>
+      <w:pPr>
+        <w:numPr>
+          <w:ilvl w:val="0"/>
+          <w:numId w:val="1012"/>
+        </w:numPr>
+      </w:pPr>
+      <w:r>
+        <w:t xml:space="preserve">Nail along edges and chalk lines</w:t>
+      </w:r>
+    </w:p>
+    <w:p>
+      <w:r>
+        <w:br w:type="page"/>
+      </w:r>
+    </w:p>
+    <w:p>
+      <w:pPr>
+        <w:pStyle w:val="FirstParagraph"/>
+      </w:pPr>
+      <w:r>
+        <w:drawing>
+          <wp:inline>
+            <wp:extent cx="5943600" cy="8229600"/>
+            <wp:effectExtent b="0" l="0" r="0" t="0"/>
+            <wp:docPr descr="" title="" id="61" name="Picture"/>
+            <a:graphic>
+              <a:graphicData uri="http://schemas.openxmlformats.org/drawingml/2006/picture">
+                <pic:pic>
+                  <pic:nvPicPr>
+                    <pic:cNvPr descr="images/platform_sngl_11.png" id="62" name="Picture"/>
+                    <pic:cNvPicPr>
+                      <a:picLocks noChangeArrowheads="1" noChangeAspect="1"/>
+                    </pic:cNvPicPr>
+                  </pic:nvPicPr>
+                  <pic:blipFill>
+                    <a:blip r:embed="rId60"/>
+                    <a:stretch>
+                      <a:fillRect/>
+                    </a:stretch>
+                  </pic:blipFill>
+                  <pic:spPr bwMode="auto">
+                    <a:xfrm>
+                      <a:off x="0" y="0"/>
+                      <a:ext cx="5943600" cy="8229600"/>
+                    </a:xfrm>
+                    <a:prstGeom prst="rect">
+                      <a:avLst/>
+                    </a:prstGeom>
+                    <a:noFill/>
+                    <a:ln w="9525">
+                      <a:noFill/>
+                      <a:headEnd/>
+                      <a:tailEnd/>
+                    </a:ln>
+                  </pic:spPr>
+                </pic:pic>
+              </a:graphicData>
+            </a:graphic>
+          </wp:inline>
+        </w:drawing>
+      </w:r>
+    </w:p>
+    <w:bookmarkEnd w:id="63"/>
+    <w:bookmarkEnd w:id="64"/>
+    <w:bookmarkStart w:id="68" w:name="step-12"/>
+    <w:p>
+      <w:pPr>
+        <w:pStyle w:val="Heading1"/>
+      </w:pPr>
+      <w:r>
+        <w:t xml:space="preserve">Step 12</w:t>
+      </w:r>
+    </w:p>
+    <w:p>
+      <w:pPr>
+        <w:numPr>
+          <w:ilvl w:val="0"/>
+          <w:numId w:val="1013"/>
+        </w:numPr>
+      </w:pPr>
+      <w:r>
+        <w:t xml:space="preserve">The next day, if necessary, router the edges of the platform (to let the adhesive dry first).</w:t>
+      </w:r>
+    </w:p>
+    <w:p>
+      <w:pPr>
+        <w:numPr>
+          <w:ilvl w:val="0"/>
+          <w:numId w:val="1013"/>
+        </w:numPr>
+      </w:pPr>
+      <w:r>
+        <w:t xml:space="preserve">Draw a line 3½ inches from the edge on all sides</w:t>
+      </w:r>
+      <w:r>
+        <w:br/>
+      </w:r>
+      <w:r>
+        <w:t xml:space="preserve">— use the marking jig; it hangs from the back saw table. Using a felt-tip pen,</w:t>
       </w:r>
       <w:r>
         <w:t xml:space="preserve"> </w:t>
       </w:r>
       <w:r>
-        <w:t xml:space="preserve">— along the seam, nail about every 8 inches, slightly angled in towards the junction line</w:t>
-      </w:r>
-      <w:r>
-        <w:t xml:space="preserve"> </w:t>
-      </w:r>
-      <w:r>
-        <w:t xml:space="preserve">and alternate the sides of the junction line.</w:t>
-      </w:r>
-    </w:p>
-    <w:p>
-      <w:pPr>
-        <w:numPr>
-          <w:ilvl w:val="0"/>
-          <w:numId w:val="1012"/>
-        </w:numPr>
-      </w:pPr>
-      <w:r>
-        <w:t xml:space="preserve">Nail along edges and chalk lines</w:t>
+        <w:t xml:space="preserve">hold it against the inside of the jig, and slide the jig along the sides of the platform.</w:t>
       </w:r>
     </w:p>
     <w:p>
@@ -1940,219 +1686,54 @@
         <w:br w:type="page"/>
       </w:r>
     </w:p>
-    <w:tbl>
-      <w:tblPr>
-        <w:tblStyle w:val="Table"/>
-        <w:tblW w:type="pct" w:w="5000"/>
-        <w:tblLayout w:type="fixed"/>
-        <w:tblLook w:firstRow="0" w:lastRow="0" w:firstColumn="0" w:lastColumn="0" w:noHBand="0" w:noVBand="0" w:val="0000"/>
-      </w:tblPr>
-      <w:tblGrid>
-        <w:gridCol w:w="7920"/>
-      </w:tblGrid>
-      <w:tr>
-        <w:tc>
-          <w:tcPr/>
-          <w:bookmarkStart w:id="83" w:name="fig-539a35d47e664c97a50115a146a7f1bd-11"/>
-          <w:p>
-            <w:pPr>
-              <w:pStyle w:val="Compact"/>
-              <w:jc w:val="center"/>
-            </w:pPr>
-            <w:bookmarkStart w:id="82" w:name="fig-539a35d47e664c97a50115a146a7f1bd-11"/>
-            <w:r>
-              <w:drawing>
-                <wp:inline>
-                  <wp:extent cx="5943600" cy="8229600"/>
-                  <wp:effectExtent b="0" l="0" r="0" t="0"/>
-                  <wp:docPr descr=" " title="" id="80" name="Picture"/>
-                  <a:graphic>
-                    <a:graphicData uri="http://schemas.openxmlformats.org/drawingml/2006/picture">
-                      <pic:pic>
-                        <pic:nvPicPr>
-                          <pic:cNvPr descr="images/platform_sngl_11.png" id="81" name="Picture"/>
-                          <pic:cNvPicPr>
-                            <a:picLocks noChangeArrowheads="1" noChangeAspect="1"/>
-                          </pic:cNvPicPr>
-                        </pic:nvPicPr>
-                        <pic:blipFill>
-                          <a:blip r:embed="rId79"/>
-                          <a:stretch>
-                            <a:fillRect/>
-                          </a:stretch>
-                        </pic:blipFill>
-                        <pic:spPr bwMode="auto">
-                          <a:xfrm>
-                            <a:off x="0" y="0"/>
-                            <a:ext cx="5943600" cy="8229600"/>
-                          </a:xfrm>
-                          <a:prstGeom prst="rect">
-                            <a:avLst/>
-                          </a:prstGeom>
-                          <a:noFill/>
-                          <a:ln w="9525">
-                            <a:noFill/>
-                            <a:headEnd/>
-                            <a:tailEnd/>
-                          </a:ln>
-                        </pic:spPr>
-                      </pic:pic>
-                    </a:graphicData>
-                  </a:graphic>
-                </wp:inline>
-              </w:drawing>
-            </w:r>
-            <w:bookmarkEnd w:id="82"/>
-          </w:p>
-          <w:p>
-            <w:pPr>
-              <w:jc w:val="center"/>
-            </w:pPr>
-            <w:pPr>
-              <w:jc w:val="start"/>
-              <w:spacing w:before="200"/>
-              <w:pStyle w:val="ImageCaption"/>
-            </w:pPr>
-            <w:r>
-              <w:t xml:space="preserve"> </w:t>
-            </w:r>
-          </w:p>
-          <w:bookmarkEnd w:id="83"/>
-        </w:tc>
-      </w:tr>
-    </w:tbl>
-    <w:bookmarkEnd w:id="84"/>
-    <w:bookmarkEnd w:id="85"/>
-    <w:bookmarkStart w:id="91" w:name="step-12"/>
-    <w:p>
-      <w:pPr>
-        <w:pStyle w:val="Heading1"/>
-      </w:pPr>
-      <w:r>
-        <w:t xml:space="preserve">Step 12</w:t>
-      </w:r>
-    </w:p>
-    <w:p>
-      <w:pPr>
-        <w:numPr>
-          <w:ilvl w:val="0"/>
-          <w:numId w:val="1013"/>
-        </w:numPr>
-      </w:pPr>
-      <w:r>
-        <w:t xml:space="preserve">The next day, if necessary, router the edges of the platform (to let the adhesive dry first).</w:t>
-      </w:r>
-    </w:p>
-    <w:p>
-      <w:pPr>
-        <w:numPr>
-          <w:ilvl w:val="0"/>
-          <w:numId w:val="1013"/>
-        </w:numPr>
-      </w:pPr>
-      <w:r>
-        <w:t xml:space="preserve">Draw a line 3½ inches from the edge on all sides</w:t>
-      </w:r>
-      <w:r>
-        <w:br/>
-      </w:r>
-      <w:r>
-        <w:t xml:space="preserve">— use the marking jig; it hangs from the back saw table. Using a felt-tip pen,</w:t>
-      </w:r>
-      <w:r>
-        <w:t xml:space="preserve"> </w:t>
-      </w:r>
-      <w:r>
-        <w:t xml:space="preserve">hold it against the inside of the jig, and slide the jig along the sides of the platform.</w:t>
-      </w:r>
-    </w:p>
-    <w:p>
-      <w:r>
-        <w:br w:type="page"/>
-      </w:r>
-    </w:p>
-    <w:tbl>
-      <w:tblPr>
-        <w:tblStyle w:val="Table"/>
-        <w:tblW w:type="pct" w:w="5000"/>
-        <w:tblLayout w:type="fixed"/>
-        <w:tblLook w:firstRow="0" w:lastRow="0" w:firstColumn="0" w:lastColumn="0" w:noHBand="0" w:noVBand="0" w:val="0000"/>
-      </w:tblPr>
-      <w:tblGrid>
-        <w:gridCol w:w="7920"/>
-      </w:tblGrid>
-      <w:tr>
-        <w:tc>
-          <w:tcPr/>
-          <w:bookmarkStart w:id="90" w:name="fig-539a35d47e664c97a50115a146a7f1bd-12"/>
-          <w:p>
-            <w:pPr>
-              <w:pStyle w:val="Compact"/>
-              <w:jc w:val="center"/>
-            </w:pPr>
-            <w:bookmarkStart w:id="89" w:name="fig-539a35d47e664c97a50115a146a7f1bd-12"/>
-            <w:r>
-              <w:drawing>
-                <wp:inline>
-                  <wp:extent cx="5943600" cy="8229600"/>
-                  <wp:effectExtent b="0" l="0" r="0" t="0"/>
-                  <wp:docPr descr=" " title="" id="87" name="Picture"/>
-                  <a:graphic>
-                    <a:graphicData uri="http://schemas.openxmlformats.org/drawingml/2006/picture">
-                      <pic:pic>
-                        <pic:nvPicPr>
-                          <pic:cNvPr descr="images/platform_sngl_12.png" id="88" name="Picture"/>
-                          <pic:cNvPicPr>
-                            <a:picLocks noChangeArrowheads="1" noChangeAspect="1"/>
-                          </pic:cNvPicPr>
-                        </pic:nvPicPr>
-                        <pic:blipFill>
-                          <a:blip r:embed="rId86"/>
-                          <a:stretch>
-                            <a:fillRect/>
-                          </a:stretch>
-                        </pic:blipFill>
-                        <pic:spPr bwMode="auto">
-                          <a:xfrm>
-                            <a:off x="0" y="0"/>
-                            <a:ext cx="5943600" cy="8229600"/>
-                          </a:xfrm>
-                          <a:prstGeom prst="rect">
-                            <a:avLst/>
-                          </a:prstGeom>
-                          <a:noFill/>
-                          <a:ln w="9525">
-                            <a:noFill/>
-                            <a:headEnd/>
-                            <a:tailEnd/>
-                          </a:ln>
-                        </pic:spPr>
-                      </pic:pic>
-                    </a:graphicData>
-                  </a:graphic>
-                </wp:inline>
-              </w:drawing>
-            </w:r>
-            <w:bookmarkEnd w:id="89"/>
-          </w:p>
-          <w:p>
-            <w:pPr>
-              <w:jc w:val="center"/>
-            </w:pPr>
-            <w:pPr>
-              <w:jc w:val="start"/>
-              <w:spacing w:before="200"/>
-              <w:pStyle w:val="ImageCaption"/>
-            </w:pPr>
-            <w:r>
-              <w:t xml:space="preserve"> </w:t>
-            </w:r>
-          </w:p>
-          <w:bookmarkEnd w:id="90"/>
-        </w:tc>
-      </w:tr>
-    </w:tbl>
-    <w:bookmarkEnd w:id="91"/>
+    <w:p>
+      <w:pPr>
+        <w:pStyle w:val="FirstParagraph"/>
+      </w:pPr>
+      <w:r>
+        <w:drawing>
+          <wp:inline>
+            <wp:extent cx="5943600" cy="8229600"/>
+            <wp:effectExtent b="0" l="0" r="0" t="0"/>
+            <wp:docPr descr="" title="" id="66" name="Picture"/>
+            <a:graphic>
+              <a:graphicData uri="http://schemas.openxmlformats.org/drawingml/2006/picture">
+                <pic:pic>
+                  <pic:nvPicPr>
+                    <pic:cNvPr descr="images/platform_sngl_12.png" id="67" name="Picture"/>
+                    <pic:cNvPicPr>
+                      <a:picLocks noChangeArrowheads="1" noChangeAspect="1"/>
+                    </pic:cNvPicPr>
+                  </pic:nvPicPr>
+                  <pic:blipFill>
+                    <a:blip r:embed="rId65"/>
+                    <a:stretch>
+                      <a:fillRect/>
+                    </a:stretch>
+                  </pic:blipFill>
+                  <pic:spPr bwMode="auto">
+                    <a:xfrm>
+                      <a:off x="0" y="0"/>
+                      <a:ext cx="5943600" cy="8229600"/>
+                    </a:xfrm>
+                    <a:prstGeom prst="rect">
+                      <a:avLst/>
+                    </a:prstGeom>
+                    <a:noFill/>
+                    <a:ln w="9525">
+                      <a:noFill/>
+                      <a:headEnd/>
+                      <a:tailEnd/>
+                    </a:ln>
+                  </pic:spPr>
+                </pic:pic>
+              </a:graphicData>
+            </a:graphic>
+          </wp:inline>
+        </w:drawing>
+      </w:r>
+    </w:p>
+    <w:bookmarkEnd w:id="68"/>
     <w:sectPr>
       <w:headerReference r:id="rId9" w:type="even"/>
       <w:headerReference r:id="rId11" w:type="default"/>
@@ -2163,7 +1744,7 @@
       <w:pgSz w:code="1" w:h="15840" w:w="12240"/>
       <w:pgMar w:bottom="1440" w:footer="708" w:gutter="0" w:header="708" w:left="1440" w:right="1440" w:top="1440"/>
       <w:cols w:space="708"/>
-      <w:docGrid w:linePitch="360"/>
+      <w:docGrid w:linePitch="381"/>
     </w:sectPr>
   </w:body>
 </w:document>
@@ -2189,54 +1770,101 @@
     <w:pPr>
       <w:pStyle w:val="Footer"/>
       <w:pBdr>
-        <w:top w:val="single" w:sz="4" w:space="1" w:color="BFBFBF" w:themeColor="background1" w:themeShade="BF"/>
+        <w:top w:val="single" w:sz="4" w:space="1" w:color="auto"/>
       </w:pBdr>
+      <w:rPr>
+        <w:sz w:val="22"/>
+      </w:rPr>
     </w:pPr>
     <w:r>
+      <w:rPr>
+        <w:sz w:val="22"/>
+      </w:rPr>
       <w:t>Sound Foundations NW</w:t>
     </w:r>
     <w:r>
+      <w:rPr>
+        <w:sz w:val="22"/>
+      </w:rPr>
       <w:ptab w:relativeTo="margin" w:alignment="center" w:leader="none"/>
     </w:r>
     <w:r>
+      <w:rPr>
+        <w:sz w:val="22"/>
+      </w:rPr>
+      <w:t xml:space="preserve"> </w:t>
+    </w:r>
+    <w:r>
+      <w:rPr>
+        <w:sz w:val="22"/>
+      </w:rPr>
       <w:fldChar w:fldCharType="begin"/>
     </w:r>
     <w:r>
+      <w:rPr>
+        <w:sz w:val="22"/>
+      </w:rPr>
       <w:instrText xml:space="preserve"> SAVEDATE  \@ "d MMMM yyyy"  \* MERGEFORMAT </w:instrText>
     </w:r>
     <w:r>
+      <w:rPr>
+        <w:sz w:val="22"/>
+      </w:rPr>
       <w:fldChar w:fldCharType="separate"/>
     </w:r>
     <w:r>
       <w:rPr>
         <w:noProof/>
+        <w:sz w:val="22"/>
       </w:rPr>
-      <w:t>24 January 2025</w:t>
+      <w:t>12 March 2025</w:t>
     </w:r>
     <w:r>
+      <w:rPr>
+        <w:sz w:val="22"/>
+      </w:rPr>
       <w:fldChar w:fldCharType="end"/>
     </w:r>
     <w:r>
+      <w:rPr>
+        <w:sz w:val="22"/>
+      </w:rPr>
+      <w:t xml:space="preserve"> </w:t>
+    </w:r>
+    <w:r>
+      <w:rPr>
+        <w:sz w:val="22"/>
+      </w:rPr>
       <w:ptab w:relativeTo="margin" w:alignment="right" w:leader="none"/>
     </w:r>
     <w:r>
+      <w:rPr>
+        <w:sz w:val="22"/>
+      </w:rPr>
       <w:fldChar w:fldCharType="begin"/>
     </w:r>
     <w:r>
+      <w:rPr>
+        <w:sz w:val="22"/>
+      </w:rPr>
       <w:instrText xml:space="preserve"> PAGE   \* MERGEFORMAT </w:instrText>
     </w:r>
     <w:r>
+      <w:rPr>
+        <w:sz w:val="22"/>
+      </w:rPr>
       <w:fldChar w:fldCharType="separate"/>
     </w:r>
     <w:r>
       <w:rPr>
         <w:noProof/>
+        <w:sz w:val="22"/>
       </w:rPr>
       <w:t>1</w:t>
     </w:r>
     <w:r>
       <w:rPr>
-        <w:noProof/>
+        <w:sz w:val="22"/>
       </w:rPr>
       <w:fldChar w:fldCharType="end"/>
     </w:r>
@@ -2308,10 +1936,11 @@
   <w:abstractNum w15:restartNumberingAfterBreak="0" w:abstractNumId="0">
     <w:nsid w:val="5BCE4232"/>
     <w:multiLevelType w:val="hybridMultilevel"/>
-    <w:tmpl w:val="622EFD06"/>
-    <w:lvl w:ilvl="0" w:tplc="0C090001">
+    <w:tmpl w:val="C14AE192"/>
+    <w:lvl w:ilvl="0" w:tplc="4A0AC008">
       <w:start w:val="1"/>
       <w:numFmt w:val="bullet"/>
+      <w:pStyle w:val="ListParagraph"/>
       <w:lvlText w:val=""/>
       <w:lvlJc w:val="left"/>
       <w:pPr>
@@ -2597,7 +2226,7 @@
       </w:rPr>
     </w:lvl>
   </w:abstractNum>
-  <w:num w16cid:durableId="1603538387" w:numId="1">
+  <w:num w16cid:durableId="101804748" w:numId="1">
     <w:abstractNumId w:val="0"/>
   </w:num>
   <w:num w:numId="1000">
@@ -3043,6 +2672,10 @@
   <w:style w:default="1" w:styleId="Normal" w:type="paragraph">
     <w:name w:val="Normal"/>
     <w:qFormat/>
+    <w:rsid w:val="00682500"/>
+    <w:rPr>
+      <w:sz w:val="28"/>
+    </w:rPr>
   </w:style>
   <w:style w:styleId="Heading1" w:type="paragraph">
     <w:name w:val="heading 1"/>
@@ -3078,7 +2711,7 @@
     <w:uiPriority w:val="9"/>
     <w:unhideWhenUsed/>
     <w:qFormat/>
-    <w:rsid w:val="00F14C3E"/>
+    <w:rsid w:val="00B467BA"/>
     <w:pPr>
       <w:keepNext/>
       <w:keepLines/>
@@ -3092,6 +2725,49 @@
       <w:color w:themeColor="accent1" w:val="4F81BD"/>
       <w:sz w:val="36"/>
       <w:szCs w:val="36"/>
+    </w:rPr>
+  </w:style>
+  <w:style w:styleId="Heading3" w:type="paragraph">
+    <w:name w:val="heading 3"/>
+    <w:basedOn w:val="Normal"/>
+    <w:next w:val="Normal"/>
+    <w:link w:val="Heading3Char"/>
+    <w:uiPriority w:val="9"/>
+    <w:unhideWhenUsed/>
+    <w:qFormat/>
+    <w:rsid w:val="001716AF"/>
+    <w:pPr>
+      <w:keepNext/>
+      <w:keepLines/>
+      <w:spacing w:after="0" w:before="120"/>
+      <w:outlineLvl w:val="2"/>
+    </w:pPr>
+    <w:rPr>
+      <w:rFonts w:ascii="Arial" w:cstheme="majorBidi" w:eastAsiaTheme="majorEastAsia" w:hAnsi="Arial"/>
+      <w:color w:themeColor="accent1" w:themeShade="7F" w:val="243F60"/>
+      <w:sz w:val="32"/>
+      <w:szCs w:val="24"/>
+    </w:rPr>
+  </w:style>
+  <w:style w:styleId="Heading4" w:type="paragraph">
+    <w:name w:val="heading 4"/>
+    <w:basedOn w:val="Normal"/>
+    <w:next w:val="Normal"/>
+    <w:link w:val="Heading4Char"/>
+    <w:uiPriority w:val="9"/>
+    <w:unhideWhenUsed/>
+    <w:qFormat/>
+    <w:rsid w:val="001716AF"/>
+    <w:pPr>
+      <w:keepNext/>
+      <w:keepLines/>
+      <w:spacing w:after="0"/>
+      <w:outlineLvl w:val="3"/>
+    </w:pPr>
+    <w:rPr>
+      <w:rFonts w:ascii="Arial" w:cs="Arial" w:eastAsiaTheme="majorEastAsia" w:hAnsi="Arial"/>
+      <w:bCs/>
+      <w:iCs/>
     </w:rPr>
   </w:style>
   <w:style w:default="1" w:styleId="DefaultParagraphFont" w:type="character">
@@ -3127,7 +2803,7 @@
     <w:link w:val="HeaderChar"/>
     <w:uiPriority w:val="99"/>
     <w:unhideWhenUsed/>
-    <w:rsid w:val="00E043FD"/>
+    <w:rsid w:val="00037B15"/>
     <w:pPr>
       <w:tabs>
         <w:tab w:pos="4513" w:val="center"/>
@@ -3142,6 +2818,9 @@
     <w:link w:val="Header"/>
     <w:uiPriority w:val="99"/>
     <w:rsid w:val="00E043FD"/>
+    <w:rPr>
+      <w:sz w:val="28"/>
+    </w:rPr>
   </w:style>
   <w:style w:styleId="Footer" w:type="paragraph">
     <w:name w:val="footer"/>
@@ -3149,7 +2828,7 @@
     <w:link w:val="FooterChar"/>
     <w:uiPriority w:val="99"/>
     <w:unhideWhenUsed/>
-    <w:rsid w:val="00E043FD"/>
+    <w:rsid w:val="00037B15"/>
     <w:pPr>
       <w:tabs>
         <w:tab w:pos="4513" w:val="center"/>
@@ -3164,6 +2843,9 @@
     <w:link w:val="Footer"/>
     <w:uiPriority w:val="99"/>
     <w:rsid w:val="00E043FD"/>
+    <w:rPr>
+      <w:sz w:val="28"/>
+    </w:rPr>
   </w:style>
   <w:style w:customStyle="1" w:styleId="3CBD5A742C28424DA5172AD252E32316" w:type="paragraph">
     <w:name w:val="3CBD5A742C28424DA5172AD252E32316"/>
@@ -3262,7 +2944,7 @@
     <w:basedOn w:val="DefaultParagraphFont"/>
     <w:link w:val="Heading2"/>
     <w:uiPriority w:val="9"/>
-    <w:rsid w:val="00F14C3E"/>
+    <w:rsid w:val="00B467BA"/>
     <w:rPr>
       <w:rFonts w:cstheme="minorHAnsi" w:eastAsiaTheme="majorEastAsia"/>
       <w:b/>
@@ -3275,13 +2957,94 @@
   <w:style w:styleId="ListParagraph" w:type="paragraph">
     <w:name w:val="List Paragraph"/>
     <w:basedOn w:val="Normal"/>
+    <w:link w:val="ListParagraphChar"/>
     <w:uiPriority w:val="34"/>
     <w:qFormat/>
-    <w:rsid w:val="0085261D"/>
+    <w:rsid w:val="002E72C0"/>
     <w:pPr>
-      <w:ind w:left="720"/>
+      <w:numPr>
+        <w:numId w:val="1"/>
+      </w:numPr>
+      <w:spacing w:after="120"/>
       <w:contextualSpacing/>
     </w:pPr>
+  </w:style>
+  <w:style w:customStyle="1" w:styleId="Heading3Char" w:type="character">
+    <w:name w:val="Heading 3 Char"/>
+    <w:basedOn w:val="DefaultParagraphFont"/>
+    <w:link w:val="Heading3"/>
+    <w:uiPriority w:val="9"/>
+    <w:rsid w:val="001716AF"/>
+    <w:rPr>
+      <w:rFonts w:ascii="Arial" w:cstheme="majorBidi" w:eastAsiaTheme="majorEastAsia" w:hAnsi="Arial"/>
+      <w:color w:themeColor="accent1" w:themeShade="7F" w:val="243F60"/>
+      <w:sz w:val="32"/>
+      <w:szCs w:val="24"/>
+    </w:rPr>
+  </w:style>
+  <w:style w:customStyle="1" w:styleId="Heading4Char" w:type="character">
+    <w:name w:val="Heading 4 Char"/>
+    <w:basedOn w:val="DefaultParagraphFont"/>
+    <w:link w:val="Heading4"/>
+    <w:uiPriority w:val="9"/>
+    <w:rsid w:val="001716AF"/>
+    <w:rPr>
+      <w:rFonts w:ascii="Arial" w:cs="Arial" w:eastAsiaTheme="majorEastAsia" w:hAnsi="Arial"/>
+      <w:bCs/>
+      <w:iCs/>
+      <w:sz w:val="28"/>
+    </w:rPr>
+  </w:style>
+  <w:style w:styleId="NoSpacing" w:type="paragraph">
+    <w:name w:val="No Spacing"/>
+    <w:uiPriority w:val="1"/>
+    <w:qFormat/>
+    <w:rsid w:val="00037B15"/>
+    <w:pPr>
+      <w:spacing w:after="0" w:line="240" w:lineRule="auto"/>
+    </w:pPr>
+    <w:rPr>
+      <w:sz w:val="28"/>
+    </w:rPr>
+  </w:style>
+  <w:style w:styleId="Revision" w:type="paragraph">
+    <w:name w:val="Revision"/>
+    <w:hidden/>
+    <w:uiPriority w:val="99"/>
+    <w:semiHidden/>
+    <w:rsid w:val="00037B15"/>
+    <w:pPr>
+      <w:spacing w:after="0" w:line="240" w:lineRule="auto"/>
+    </w:pPr>
+  </w:style>
+  <w:style w:customStyle="1" w:styleId="Bulleted" w:type="paragraph">
+    <w:name w:val="Bulleted"/>
+    <w:basedOn w:val="ListParagraph"/>
+    <w:link w:val="BulletedChar"/>
+    <w:qFormat/>
+    <w:rsid w:val="006E24A1"/>
+    <w:pPr>
+      <w:spacing w:after="0"/>
+    </w:pPr>
+  </w:style>
+  <w:style w:customStyle="1" w:styleId="ListParagraphChar" w:type="character">
+    <w:name w:val="List Paragraph Char"/>
+    <w:basedOn w:val="DefaultParagraphFont"/>
+    <w:link w:val="ListParagraph"/>
+    <w:uiPriority w:val="34"/>
+    <w:rsid w:val="006E24A1"/>
+    <w:rPr>
+      <w:sz w:val="28"/>
+    </w:rPr>
+  </w:style>
+  <w:style w:customStyle="1" w:styleId="BulletedChar" w:type="character">
+    <w:name w:val="Bulleted Char"/>
+    <w:basedOn w:val="ListParagraphChar"/>
+    <w:link w:val="Bulleted"/>
+    <w:rsid w:val="006E24A1"/>
+    <w:rPr>
+      <w:sz w:val="28"/>
+    </w:rPr>
   </w:style>
   <w:style w:type="paragraph" w:customStyle="1" w:styleId="SourceCode">
     <w:name w:val="Source Code"/>

</xml_diff>

<commit_message>
Update platform to match changes to jig guides for rim joists
</commit_message>
<xml_diff>
--- a/Platform/Platform_sngl_side.docx
+++ b/Platform/Platform_sngl_side.docx
@@ -207,24 +207,6 @@
       </w:r>
       <w:r>
         <w:t xml:space="preserve">— one person holds flush on top and sides, other person nails</w:t>
-      </w:r>
-      <w:r>
-        <w:br/>
-      </w:r>
-      <w:r>
-        <w:t xml:space="preserve">— put jenga board placeholder where 2</w:t>
-      </w:r>
-      <w:r>
-        <w:rPr>
-          <w:vertAlign w:val="superscript"/>
-        </w:rPr>
-        <w:t xml:space="preserve">nd</w:t>
-      </w:r>
-      <w:r>
-        <w:t xml:space="preserve"> </w:t>
-      </w:r>
-      <w:r>
-        <w:t xml:space="preserve">board will go</w:t>
       </w:r>
     </w:p>
     <w:p>

</xml_diff>